<commit_message>
Refine course report as paper
</commit_message>
<xml_diff>
--- a/course_submission/Minecraft_Constructing_Agents_课程报告.docx
+++ b/course_submission/Minecraft_Constructing_Agents_课程报告.docx
@@ -4,100 +4,101 @@
   <w:body>
     <w:p>
       <w:pPr>
+        <w:spacing w:before="120" w:after="200"/>
+        <w:ind w:firstLine="0"/>
         <w:jc w:val="center"/>
       </w:pPr>
       <w:r>
         <w:rPr>
-          <w:rFonts w:ascii="Calibri" w:hAnsi="Calibri" w:eastAsia="Microsoft YaHei"/>
+          <w:rFonts w:ascii="Times New Roman" w:hAnsi="Times New Roman" w:eastAsia="SimHei"/>
           <w:b/>
-          <w:color w:val="1F4D78"/>
-          <w:sz w:val="40"/>
+          <w:sz w:val="32"/>
         </w:rPr>
         <w:t>Minecraft 建筑生成多智能体系统：从中文需求到可执行数据包</w:t>
       </w:r>
     </w:p>
     <w:p>
       <w:pPr>
+        <w:spacing w:after="40"/>
+        <w:ind w:firstLine="0"/>
         <w:jc w:val="center"/>
       </w:pPr>
       <w:r>
         <w:rPr>
-          <w:rFonts w:ascii="Calibri" w:hAnsi="Calibri" w:eastAsia="Microsoft YaHei"/>
-          <w:color w:val="333333"/>
-          <w:sz w:val="26"/>
-        </w:rPr>
-        <w:t>《大语言模型与信息决策》课程项目书面报告</w:t>
-      </w:r>
-    </w:p>
-    <w:p>
-      <w:pPr>
-        <w:jc w:val="center"/>
-      </w:pPr>
-      <w:r>
-        <w:rPr>
-          <w:rFonts w:ascii="Calibri" w:hAnsi="Calibri" w:eastAsia="Microsoft YaHei"/>
-          <w:sz w:val="22"/>
+          <w:rFonts w:ascii="Times New Roman" w:hAnsi="Times New Roman" w:eastAsia="SimSun"/>
+          <w:b w:val="0"/>
+          <w:sz w:val="21"/>
         </w:rPr>
         <w:t>龙想 2300011196；石宇宸 2300011051</w:t>
       </w:r>
     </w:p>
     <w:p>
       <w:pPr>
+        <w:spacing w:after="40"/>
+        <w:ind w:firstLine="0"/>
         <w:jc w:val="center"/>
       </w:pPr>
       <w:r>
         <w:rPr>
-          <w:rFonts w:ascii="Calibri" w:hAnsi="Calibri" w:eastAsia="Microsoft YaHei"/>
-          <w:sz w:val="22"/>
+          <w:rFonts w:ascii="Times New Roman" w:hAnsi="Times New Roman" w:eastAsia="SimSun"/>
+          <w:b w:val="0"/>
+          <w:sz w:val="21"/>
+        </w:rPr>
+        <w:t>《大语言模型与信息决策》课程项目</w:t>
+      </w:r>
+    </w:p>
+    <w:p>
+      <w:pPr>
+        <w:spacing w:after="200"/>
+        <w:ind w:firstLine="0"/>
+        <w:jc w:val="center"/>
+      </w:pPr>
+      <w:r>
+        <w:rPr>
+          <w:rFonts w:ascii="Times New Roman" w:hAnsi="Times New Roman" w:eastAsia="SimSun"/>
+          <w:b w:val="0"/>
+          <w:sz w:val="21"/>
         </w:rPr>
         <w:t>2026 年 6 月</w:t>
       </w:r>
     </w:p>
     <w:p>
       <w:pPr>
-        <w:jc w:val="center"/>
+        <w:spacing w:after="60"/>
+        <w:ind w:firstLine="0"/>
+        <w:jc w:val="left"/>
       </w:pPr>
       <w:r>
         <w:rPr>
-          <w:rFonts w:ascii="Calibri" w:hAnsi="Calibri" w:eastAsia="Microsoft YaHei"/>
+          <w:rFonts w:ascii="Times New Roman" w:hAnsi="Times New Roman" w:eastAsia="SimHei"/>
+          <w:b/>
           <w:sz w:val="22"/>
         </w:rPr>
-        <w:t>https://github.com/CityC196/Minecraft-Constructing-Agents</w:t>
-      </w:r>
-    </w:p>
-    <w:p>
-      <w:r>
-        <w:br w:type="page"/>
+        <w:t>摘要</w:t>
       </w:r>
     </w:p>
     <w:p>
       <w:pPr>
-        <w:pStyle w:val="Heading1"/>
+        <w:ind w:firstLine="440"/>
+        <w:jc w:val="both"/>
       </w:pPr>
       <w:r>
-        <w:t>摘要</w:t>
+        <w:rPr>
+          <w:rFonts w:ascii="Times New Roman" w:hAnsi="Times New Roman" w:eastAsia="SimSun"/>
+          <w:sz w:val="22"/>
+        </w:rPr>
+        <w:t>Minecraft 建筑生成任务同时涉及自然语言理解、空间规划、材料选择、几何约束、连通性校验和游戏数据包导出。若直接要求大语言模型输出具体方块坐标，系统容易出现非法材料、坐标不一致、房间不连通和命令不可执行等问题。本文介绍一套面向 Minecraft Java 的建筑生成多智能体系统。系统将大语言模型限制在高层语义决策层，使其输出风格、体块、材料、房间拓扑和设计意图等 JSON；随后由本地确定性几何引擎完成 CSG 体块生成、BSP 房间划分、A* 连通路径、室内装饰、质量校验、自动修复和数据包导出。项目从最初的单一建筑智能体逐步迭代为多智能体流水线，并进一步加入模板语料学习、设计法则蒸馏、审美审计与候选择优机制。当前版本支持无 API key 的 mock 模式，可生成 blueprint.json、architect_datapack、preview.html 和 run_report.md；全量测试结果为 176 项通过、0 项失败。</w:t>
       </w:r>
     </w:p>
     <w:p>
+      <w:pPr>
+        <w:ind w:firstLine="0"/>
+        <w:jc w:val="both"/>
+      </w:pPr>
       <w:r>
         <w:rPr>
-          <w:rFonts w:ascii="Calibri" w:hAnsi="Calibri" w:eastAsia="Microsoft YaHei"/>
-        </w:rPr>
-        <w:t>本项目面向 Minecraft Java 1.21 的建筑自动生成任务，尝试把中文自然语言建房需求转换为可直接安装到游戏世界的数据包。项目的核心取舍是：不让大语言模型直接输出具体 XYZ 方块坐标，而是让其生成建筑风格、材料、体块、房间拓扑和设计意图等高层语义 JSON；随后由本地 JavaScript 几何引擎完成 CSG 体块生成、BSP 房间切分、A* 门洞和楼梯连通、室内装饰落块、命令压缩与校验。</w:t>
-      </w:r>
-    </w:p>
-    <w:p>
-      <w:r>
-        <w:rPr>
-          <w:rFonts w:ascii="Calibri" w:hAnsi="Calibri" w:eastAsia="Microsoft YaHei"/>
-        </w:rPr>
-        <w:t>在实现过程中，项目从最初的单一建筑智能体逐步迭代为多智能体流水线，并加入模板语料学习、设计法则蒸馏、审美审计、自动修复和候选择优。当前系统可以在没有 API key 的 mock 模式下完整运行，生成 blueprint.json、architect_datapack、preview.html 和 run_report.md。仓库基线测试为 173 项通过；加入课程提交文档测试后，当前全量测试为 176 项通过、0 项失败。</w:t>
-      </w:r>
-    </w:p>
-    <w:p>
-      <w:r>
-        <w:rPr>
-          <w:rFonts w:ascii="Calibri" w:hAnsi="Calibri" w:eastAsia="Microsoft YaHei"/>
+          <w:rFonts w:ascii="Times New Roman" w:hAnsi="Times New Roman" w:eastAsia="SimSun"/>
+          <w:sz w:val="22"/>
         </w:rPr>
         <w:t>关键词：大语言模型智能体；Minecraft；多智能体系统；CSG；BSP；A*；数据包</w:t>
       </w:r>
@@ -107,56 +108,46 @@
         <w:pStyle w:val="Heading1"/>
       </w:pPr>
       <w:r>
-        <w:t>1. 选题动机：开放建筑任务中的不确定性</w:t>
-      </w:r>
-    </w:p>
-    <w:p>
-      <w:r>
-        <w:rPr>
-          <w:rFonts w:ascii="Calibri" w:hAnsi="Calibri" w:eastAsia="Microsoft YaHei"/>
-        </w:rPr>
-        <w:t>Minecraft 建筑生成看似只是“把房子搭出来”，但实际同时包含语义理解、空间规划、材料选择、几何约束、连通性、审美风格和游戏版本兼容等问题。用户的一句中文需求可能只写“建一个欧式大房子”，但系统需要进一步判断尺度、层数、入口、房间、屋顶、窗、路径、装饰和数据包输出方式。</w:t>
-      </w:r>
-    </w:p>
-    <w:p>
-      <w:r>
-        <w:rPr>
-          <w:rFonts w:ascii="Calibri" w:hAnsi="Calibri" w:eastAsia="Microsoft YaHei"/>
-        </w:rPr>
-        <w:t>如果直接要求大模型生成每一个方块坐标，结果通常难以稳定复现：坐标可能越界，材料 ID 可能不存在，房间可能不连通，楼梯或门洞可能缺失，生成命令也可能超过 Minecraft 限制。基于这个观察，我们把项目目标调整为“让 LLM 做语义决策，让本地程序做确定性落地”。这个改动是后续所有架构设计的出发点。</w:t>
+        <w:t>1 引言</w:t>
       </w:r>
     </w:p>
     <w:p>
       <w:pPr>
-        <w:pStyle w:val="ListBullet"/>
+        <w:ind w:firstLine="440"/>
+        <w:jc w:val="both"/>
       </w:pPr>
       <w:r>
         <w:rPr>
-          <w:rFonts w:ascii="Calibri" w:hAnsi="Calibri" w:eastAsia="Microsoft YaHei"/>
+          <w:rFonts w:ascii="Times New Roman" w:hAnsi="Times New Roman" w:eastAsia="SimSun"/>
+          <w:sz w:val="22"/>
         </w:rPr>
-        <w:t>课程相关性：项目围绕大模型智能体与多智能体协作展开，而不是普通游戏脚本。</w:t>
+        <w:t>Minecraft 的开放世界为生成式建筑提供了直观的实验场景。用户可以用一句中文描述建筑需求，例如“建一个欧式大房子”或“建造一个木屋别墅”，但系统真正需要解决的问题远不止文本生成。一个可用的建筑结果必须包含合理尺度、入口、房间、楼梯、屋顶、窗、材料、内饰、路径和最终可执行的 Minecraft 命令。</w:t>
       </w:r>
     </w:p>
     <w:p>
       <w:pPr>
-        <w:pStyle w:val="ListBullet"/>
+        <w:ind w:firstLine="440"/>
+        <w:jc w:val="both"/>
       </w:pPr>
       <w:r>
         <w:rPr>
-          <w:rFonts w:ascii="Calibri" w:hAnsi="Calibri" w:eastAsia="Microsoft YaHei"/>
+          <w:rFonts w:ascii="Times New Roman" w:hAnsi="Times New Roman" w:eastAsia="SimSun"/>
+          <w:sz w:val="22"/>
         </w:rPr>
-        <w:t>任务完整性：从中文输入到 Minecraft 数据包输出形成闭环。</w:t>
+        <w:t>项目早期的设想是让智能体直接把需求变成建筑蓝图或命令。实际尝试后，我们发现这一路径不稳定：大模型擅长描述建筑意图，却不擅长长期保持三维坐标、材料注册名和拓扑约束的一致性。由此，项目的核心问题被重新定义为：如何让大模型负责语义与设计决策，同时让本地程序负责确定性几何落地和工程校验。</w:t>
       </w:r>
     </w:p>
     <w:p>
       <w:pPr>
-        <w:pStyle w:val="ListBullet"/>
+        <w:ind w:firstLine="440"/>
+        <w:jc w:val="both"/>
       </w:pPr>
       <w:r>
         <w:rPr>
-          <w:rFonts w:ascii="Calibri" w:hAnsi="Calibri" w:eastAsia="Microsoft YaHei"/>
+          <w:rFonts w:ascii="Times New Roman" w:hAnsi="Times New Roman" w:eastAsia="SimSun"/>
+          <w:sz w:val="22"/>
         </w:rPr>
-        <w:t>可复现性：mock 模式不依赖 token 或外部 API，便于评阅。</w:t>
+        <w:t>本文围绕这一修改后的问题定义展开。系统目标不是制作一个实时连服机器人，而是构建从中文需求到 Minecraft 可安装数据包的完整、可复现、可测试流水线。</w:t>
       </w:r>
     </w:p>
     <w:p>
@@ -164,53 +155,82 @@
         <w:pStyle w:val="Heading1"/>
       </w:pPr>
       <w:r>
-        <w:t>2. 总体方案：LLM 语义智能体 + 本地几何引擎</w:t>
+        <w:t>2 系统总体设计</w:t>
       </w:r>
     </w:p>
     <w:p>
+      <w:pPr>
+        <w:ind w:firstLine="440"/>
+        <w:jc w:val="both"/>
+      </w:pPr>
       <w:r>
         <w:rPr>
-          <w:rFonts w:ascii="Calibri" w:hAnsi="Calibri" w:eastAsia="Microsoft YaHei"/>
+          <w:rFonts w:ascii="Times New Roman" w:hAnsi="Times New Roman" w:eastAsia="SimSun"/>
+          <w:sz w:val="22"/>
         </w:rPr>
-        <w:t>项目采用混合式架构。ArchitectAgent、PlannerAgent、CreativeDesignAgent 等智能体只生成高层 JSON，描述风格、材料、体块、房间拓扑、立面节奏和场地语义。CSGBuilder、BSPPartitioner、AStarPathfinder 等本地模块再把语义描述变成合法方块网格。最后由 DecoratorAgent、QA、Repair 和 Optimizer 完成室内装饰、约束修复、质量检查和命令压缩。</w:t>
+        <w:t>系统采用“LLM 语义智能体与本地确定性几何引擎”相结合的混合架构。ArchitectAgent、PlannerAgent、CreativeDesignAgent 等模块只输出高层 JSON，描述风格、材料、体块、房间拓扑、立面节奏和场地语义。CSGBuilder、BSPPartitioner、AStarPathfinder 等本地模块再把语义描述转换为合法方块网格。Decorator、QA、Repair 和 Optimizer 模块负责室内落块、约束修复、质量检查与命令压缩。</w:t>
       </w:r>
     </w:p>
     <w:p>
+      <w:pPr>
+        <w:ind w:firstLine="440"/>
+        <w:jc w:val="both"/>
+      </w:pPr>
       <w:r>
         <w:rPr>
-          <w:rFonts w:ascii="Calibri" w:hAnsi="Calibri" w:eastAsia="Microsoft YaHei"/>
+          <w:rFonts w:ascii="Times New Roman" w:hAnsi="Times New Roman" w:eastAsia="SimSun"/>
+          <w:sz w:val="22"/>
         </w:rPr>
-        <w:t>这一架构把大模型的创造力保留在适合它的抽象层，同时把确定性、安全性和 Minecraft 版本兼容交给程序。它也让系统可以在 LLM 不可用时退回本地规则兜底，保持一个稳定演示和提交版本。</w:t>
+        <w:t>这种边界划分保留了大语言模型在开放需求理解和风格构思上的优势，也避免让模型直接承担坐标计算、Minecraft 材料校验和命令体积控制等确定性任务。系统还保留 mock 模式，当外部模型不可用时仍可生成完整输出，便于课程评阅和复现实验。</w:t>
+      </w:r>
+    </w:p>
+    <w:p>
+      <w:pPr>
+        <w:spacing w:before="80" w:after="80"/>
+        <w:ind w:firstLine="0"/>
+        <w:jc w:val="center"/>
+      </w:pPr>
+      <w:r>
+        <w:rPr>
+          <w:rFonts w:ascii="Times New Roman" w:hAnsi="Times New Roman" w:eastAsia="SimSun"/>
+          <w:b/>
+          <w:sz w:val="21"/>
+        </w:rPr>
+        <w:t>表 1 系统层次与模块职责</w:t>
       </w:r>
     </w:p>
     <w:tbl>
       <w:tblPr>
         <w:tblStyle w:val="TableGrid"/>
-        <w:tblW w:type="auto" w:w="0"/>
+        <w:tblW w:type="dxa" w:w="9360"/>
         <w:jc w:val="center"/>
+        <w:tblLayout w:type="fixed"/>
         <w:tblLook w:firstColumn="1" w:firstRow="1" w:lastColumn="0" w:lastRow="0" w:noHBand="0" w:noVBand="1" w:val="04A0"/>
+        <w:tblInd w:type="dxa" w:w="120"/>
       </w:tblPr>
       <w:tblGrid>
-        <w:gridCol w:w="3120"/>
-        <w:gridCol w:w="3120"/>
-        <w:gridCol w:w="3120"/>
+        <w:gridCol w:w="1656"/>
+        <w:gridCol w:w="3024"/>
+        <w:gridCol w:w="4680"/>
       </w:tblGrid>
       <w:tr>
         <w:tc>
           <w:tcPr>
-            <w:tcW w:type="dxa" w:w="3120"/>
+            <w:tcW w:type="dxa" w:w="1656"/>
             <w:vAlign w:val="center"/>
-            <w:shd w:fill="F2F4F7"/>
+            <w:shd w:fill="F2F2F2"/>
           </w:tcPr>
           <w:p>
             <w:pPr>
               <w:spacing w:after="0"/>
+              <w:ind w:firstLine="0"/>
+              <w:jc w:val="center"/>
             </w:pPr>
             <w:r>
               <w:rPr>
-                <w:rFonts w:ascii="Calibri" w:hAnsi="Calibri" w:eastAsia="Microsoft YaHei"/>
+                <w:rFonts w:ascii="Times New Roman" w:hAnsi="Times New Roman" w:eastAsia="SimSun"/>
                 <w:b/>
-                <w:sz w:val="20"/>
+                <w:sz w:val="19"/>
               </w:rPr>
               <w:t>层次</w:t>
             </w:r>
@@ -218,41 +238,45 @@
         </w:tc>
         <w:tc>
           <w:tcPr>
-            <w:tcW w:type="dxa" w:w="3120"/>
+            <w:tcW w:type="dxa" w:w="3024"/>
             <w:vAlign w:val="center"/>
-            <w:shd w:fill="F2F4F7"/>
+            <w:shd w:fill="F2F2F2"/>
           </w:tcPr>
           <w:p>
             <w:pPr>
               <w:spacing w:after="0"/>
+              <w:ind w:firstLine="0"/>
+              <w:jc w:val="center"/>
             </w:pPr>
             <w:r>
               <w:rPr>
-                <w:rFonts w:ascii="Calibri" w:hAnsi="Calibri" w:eastAsia="Microsoft YaHei"/>
+                <w:rFonts w:ascii="Times New Roman" w:hAnsi="Times New Roman" w:eastAsia="SimSun"/>
                 <w:b/>
-                <w:sz w:val="20"/>
+                <w:sz w:val="19"/>
               </w:rPr>
-              <w:t>主要模块</w:t>
+              <w:t>代表模块</w:t>
             </w:r>
           </w:p>
         </w:tc>
         <w:tc>
           <w:tcPr>
-            <w:tcW w:type="dxa" w:w="3120"/>
+            <w:tcW w:type="dxa" w:w="4680"/>
             <w:vAlign w:val="center"/>
-            <w:shd w:fill="F2F4F7"/>
+            <w:shd w:fill="F2F2F2"/>
           </w:tcPr>
           <w:p>
             <w:pPr>
               <w:spacing w:after="0"/>
+              <w:ind w:firstLine="0"/>
+              <w:jc w:val="left"/>
             </w:pPr>
             <w:r>
               <w:rPr>
-                <w:rFonts w:ascii="Calibri" w:hAnsi="Calibri" w:eastAsia="Microsoft YaHei"/>
+                <w:rFonts w:ascii="Times New Roman" w:hAnsi="Times New Roman" w:eastAsia="SimSun"/>
                 <w:b/>
-                <w:sz w:val="20"/>
+                <w:sz w:val="19"/>
               </w:rPr>
-              <w:t>作用</w:t>
+              <w:t>主要职责</w:t>
             </w:r>
           </w:p>
         </w:tc>
@@ -260,18 +284,20 @@
       <w:tr>
         <w:tc>
           <w:tcPr>
-            <w:tcW w:type="dxa" w:w="3120"/>
+            <w:tcW w:type="dxa" w:w="1656"/>
             <w:vAlign w:val="center"/>
           </w:tcPr>
           <w:p>
             <w:pPr>
               <w:spacing w:after="0"/>
+              <w:ind w:firstLine="0"/>
+              <w:jc w:val="center"/>
             </w:pPr>
             <w:r>
               <w:rPr>
-                <w:rFonts w:ascii="Calibri" w:hAnsi="Calibri" w:eastAsia="Microsoft YaHei"/>
+                <w:rFonts w:ascii="Times New Roman" w:hAnsi="Times New Roman" w:eastAsia="SimSun"/>
                 <w:b w:val="0"/>
-                <w:sz w:val="20"/>
+                <w:sz w:val="19"/>
               </w:rPr>
               <w:t>语义层</w:t>
             </w:r>
@@ -279,39 +305,43 @@
         </w:tc>
         <w:tc>
           <w:tcPr>
-            <w:tcW w:type="dxa" w:w="3120"/>
+            <w:tcW w:type="dxa" w:w="3024"/>
             <w:vAlign w:val="center"/>
           </w:tcPr>
           <w:p>
             <w:pPr>
               <w:spacing w:after="0"/>
+              <w:ind w:firstLine="0"/>
+              <w:jc w:val="center"/>
             </w:pPr>
             <w:r>
               <w:rPr>
-                <w:rFonts w:ascii="Calibri" w:hAnsi="Calibri" w:eastAsia="Microsoft YaHei"/>
+                <w:rFonts w:ascii="Times New Roman" w:hAnsi="Times New Roman" w:eastAsia="SimSun"/>
                 <w:b w:val="0"/>
-                <w:sz w:val="20"/>
+                <w:sz w:val="19"/>
               </w:rPr>
-              <w:t>ArchitectAgent / PlannerAgent</w:t>
+              <w:t>ArchitectAgent, PlannerAgent</w:t>
             </w:r>
           </w:p>
         </w:tc>
         <w:tc>
           <w:tcPr>
-            <w:tcW w:type="dxa" w:w="3120"/>
+            <w:tcW w:type="dxa" w:w="4680"/>
             <w:vAlign w:val="center"/>
           </w:tcPr>
           <w:p>
             <w:pPr>
               <w:spacing w:after="0"/>
+              <w:ind w:firstLine="0"/>
+              <w:jc w:val="left"/>
             </w:pPr>
             <w:r>
               <w:rPr>
-                <w:rFonts w:ascii="Calibri" w:hAnsi="Calibri" w:eastAsia="Microsoft YaHei"/>
+                <w:rFonts w:ascii="Times New Roman" w:hAnsi="Times New Roman" w:eastAsia="SimSun"/>
                 <w:b w:val="0"/>
-                <w:sz w:val="20"/>
+                <w:sz w:val="19"/>
               </w:rPr>
-              <w:t>生成外壳语义、材料意图、房间拓扑和连通要求</w:t>
+              <w:t>将中文需求转化为风格、材料、体块和房间拓扑 JSON</w:t>
             </w:r>
           </w:p>
         </w:tc>
@@ -319,18 +349,20 @@
       <w:tr>
         <w:tc>
           <w:tcPr>
-            <w:tcW w:type="dxa" w:w="3120"/>
+            <w:tcW w:type="dxa" w:w="1656"/>
             <w:vAlign w:val="center"/>
           </w:tcPr>
           <w:p>
             <w:pPr>
               <w:spacing w:after="0"/>
+              <w:ind w:firstLine="0"/>
+              <w:jc w:val="center"/>
             </w:pPr>
             <w:r>
               <w:rPr>
-                <w:rFonts w:ascii="Calibri" w:hAnsi="Calibri" w:eastAsia="Microsoft YaHei"/>
+                <w:rFonts w:ascii="Times New Roman" w:hAnsi="Times New Roman" w:eastAsia="SimSun"/>
                 <w:b w:val="0"/>
-                <w:sz w:val="20"/>
+                <w:sz w:val="19"/>
               </w:rPr>
               <w:t>知识层</w:t>
             </w:r>
@@ -338,18 +370,20 @@
         </w:tc>
         <w:tc>
           <w:tcPr>
-            <w:tcW w:type="dxa" w:w="3120"/>
+            <w:tcW w:type="dxa" w:w="3024"/>
             <w:vAlign w:val="center"/>
           </w:tcPr>
           <w:p>
             <w:pPr>
               <w:spacing w:after="0"/>
+              <w:ind w:firstLine="0"/>
+              <w:jc w:val="center"/>
             </w:pPr>
             <w:r>
               <w:rPr>
-                <w:rFonts w:ascii="Calibri" w:hAnsi="Calibri" w:eastAsia="Microsoft YaHei"/>
+                <w:rFonts w:ascii="Times New Roman" w:hAnsi="Times New Roman" w:eastAsia="SimSun"/>
                 <w:b w:val="0"/>
-                <w:sz w:val="20"/>
+                <w:sz w:val="19"/>
               </w:rPr>
               <w:t>TemplateKnowledgeAgent</w:t>
             </w:r>
@@ -357,20 +391,22 @@
         </w:tc>
         <w:tc>
           <w:tcPr>
-            <w:tcW w:type="dxa" w:w="3120"/>
+            <w:tcW w:type="dxa" w:w="4680"/>
             <w:vAlign w:val="center"/>
           </w:tcPr>
           <w:p>
             <w:pPr>
               <w:spacing w:after="0"/>
+              <w:ind w:firstLine="0"/>
+              <w:jc w:val="left"/>
             </w:pPr>
             <w:r>
               <w:rPr>
-                <w:rFonts w:ascii="Calibri" w:hAnsi="Calibri" w:eastAsia="Microsoft YaHei"/>
+                <w:rFonts w:ascii="Times New Roman" w:hAnsi="Times New Roman" w:eastAsia="SimSun"/>
                 <w:b w:val="0"/>
-                <w:sz w:val="20"/>
+                <w:sz w:val="19"/>
               </w:rPr>
-              <w:t>检索模板案例、设计法则和非复制约束</w:t>
+              <w:t>从本地 schematic 案例中检索可迁移设计语法</w:t>
             </w:r>
           </w:p>
         </w:tc>
@@ -378,18 +414,20 @@
       <w:tr>
         <w:tc>
           <w:tcPr>
-            <w:tcW w:type="dxa" w:w="3120"/>
+            <w:tcW w:type="dxa" w:w="1656"/>
             <w:vAlign w:val="center"/>
           </w:tcPr>
           <w:p>
             <w:pPr>
               <w:spacing w:after="0"/>
+              <w:ind w:firstLine="0"/>
+              <w:jc w:val="center"/>
             </w:pPr>
             <w:r>
               <w:rPr>
-                <w:rFonts w:ascii="Calibri" w:hAnsi="Calibri" w:eastAsia="Microsoft YaHei"/>
+                <w:rFonts w:ascii="Times New Roman" w:hAnsi="Times New Roman" w:eastAsia="SimSun"/>
                 <w:b w:val="0"/>
-                <w:sz w:val="20"/>
+                <w:sz w:val="19"/>
               </w:rPr>
               <w:t>几何层</w:t>
             </w:r>
@@ -397,39 +435,43 @@
         </w:tc>
         <w:tc>
           <w:tcPr>
-            <w:tcW w:type="dxa" w:w="3120"/>
+            <w:tcW w:type="dxa" w:w="3024"/>
             <w:vAlign w:val="center"/>
           </w:tcPr>
           <w:p>
             <w:pPr>
               <w:spacing w:after="0"/>
+              <w:ind w:firstLine="0"/>
+              <w:jc w:val="center"/>
             </w:pPr>
             <w:r>
               <w:rPr>
-                <w:rFonts w:ascii="Calibri" w:hAnsi="Calibri" w:eastAsia="Microsoft YaHei"/>
+                <w:rFonts w:ascii="Times New Roman" w:hAnsi="Times New Roman" w:eastAsia="SimSun"/>
                 <w:b w:val="0"/>
-                <w:sz w:val="20"/>
+                <w:sz w:val="19"/>
               </w:rPr>
-              <w:t>CSG / BSP / A*</w:t>
+              <w:t>CSGBuilder, BSPPartitioner, AStarPathfinder</w:t>
             </w:r>
           </w:p>
         </w:tc>
         <w:tc>
           <w:tcPr>
-            <w:tcW w:type="dxa" w:w="3120"/>
+            <w:tcW w:type="dxa" w:w="4680"/>
             <w:vAlign w:val="center"/>
           </w:tcPr>
           <w:p>
             <w:pPr>
               <w:spacing w:after="0"/>
+              <w:ind w:firstLine="0"/>
+              <w:jc w:val="left"/>
             </w:pPr>
             <w:r>
               <w:rPr>
-                <w:rFonts w:ascii="Calibri" w:hAnsi="Calibri" w:eastAsia="Microsoft YaHei"/>
+                <w:rFonts w:ascii="Times New Roman" w:hAnsi="Times New Roman" w:eastAsia="SimSun"/>
                 <w:b w:val="0"/>
-                <w:sz w:val="20"/>
+                <w:sz w:val="19"/>
               </w:rPr>
-              <w:t>生成体块、房间、门洞、楼梯和可通行路径</w:t>
+              <w:t>生成外壳、房间、门洞、楼梯和可达路径</w:t>
             </w:r>
           </w:p>
         </w:tc>
@@ -437,18 +479,85 @@
       <w:tr>
         <w:tc>
           <w:tcPr>
-            <w:tcW w:type="dxa" w:w="3120"/>
+            <w:tcW w:type="dxa" w:w="1656"/>
             <w:vAlign w:val="center"/>
           </w:tcPr>
           <w:p>
             <w:pPr>
               <w:spacing w:after="0"/>
+              <w:ind w:firstLine="0"/>
+              <w:jc w:val="center"/>
             </w:pPr>
             <w:r>
               <w:rPr>
-                <w:rFonts w:ascii="Calibri" w:hAnsi="Calibri" w:eastAsia="Microsoft YaHei"/>
+                <w:rFonts w:ascii="Times New Roman" w:hAnsi="Times New Roman" w:eastAsia="SimSun"/>
                 <w:b w:val="0"/>
-                <w:sz w:val="20"/>
+                <w:sz w:val="19"/>
+              </w:rPr>
+              <w:t>质量层</w:t>
+            </w:r>
+          </w:p>
+        </w:tc>
+        <w:tc>
+          <w:tcPr>
+            <w:tcW w:type="dxa" w:w="3024"/>
+            <w:vAlign w:val="center"/>
+          </w:tcPr>
+          <w:p>
+            <w:pPr>
+              <w:spacing w:after="0"/>
+              <w:ind w:firstLine="0"/>
+              <w:jc w:val="center"/>
+            </w:pPr>
+            <w:r>
+              <w:rPr>
+                <w:rFonts w:ascii="Times New Roman" w:hAnsi="Times New Roman" w:eastAsia="SimSun"/>
+                <w:b w:val="0"/>
+                <w:sz w:val="19"/>
+              </w:rPr>
+              <w:t>QA, Repair, Optimizer</w:t>
+            </w:r>
+          </w:p>
+        </w:tc>
+        <w:tc>
+          <w:tcPr>
+            <w:tcW w:type="dxa" w:w="4680"/>
+            <w:vAlign w:val="center"/>
+          </w:tcPr>
+          <w:p>
+            <w:pPr>
+              <w:spacing w:after="0"/>
+              <w:ind w:firstLine="0"/>
+              <w:jc w:val="left"/>
+            </w:pPr>
+            <w:r>
+              <w:rPr>
+                <w:rFonts w:ascii="Times New Roman" w:hAnsi="Times New Roman" w:eastAsia="SimSun"/>
+                <w:b w:val="0"/>
+                <w:sz w:val="19"/>
+              </w:rPr>
+              <w:t>校验材料、连通性、模板法则覆盖和命令数量</w:t>
+            </w:r>
+          </w:p>
+        </w:tc>
+      </w:tr>
+      <w:tr>
+        <w:tc>
+          <w:tcPr>
+            <w:tcW w:type="dxa" w:w="1656"/>
+            <w:vAlign w:val="center"/>
+          </w:tcPr>
+          <w:p>
+            <w:pPr>
+              <w:spacing w:after="0"/>
+              <w:ind w:firstLine="0"/>
+              <w:jc w:val="center"/>
+            </w:pPr>
+            <w:r>
+              <w:rPr>
+                <w:rFonts w:ascii="Times New Roman" w:hAnsi="Times New Roman" w:eastAsia="SimSun"/>
+                <w:b w:val="0"/>
+                <w:sz w:val="19"/>
               </w:rPr>
               <w:t>导出层</w:t>
             </w:r>
@@ -456,39 +565,43 @@
         </w:tc>
         <w:tc>
           <w:tcPr>
-            <w:tcW w:type="dxa" w:w="3120"/>
+            <w:tcW w:type="dxa" w:w="3024"/>
             <w:vAlign w:val="center"/>
           </w:tcPr>
           <w:p>
             <w:pPr>
               <w:spacing w:after="0"/>
+              <w:ind w:firstLine="0"/>
+              <w:jc w:val="center"/>
             </w:pPr>
             <w:r>
               <w:rPr>
-                <w:rFonts w:ascii="Calibri" w:hAnsi="Calibri" w:eastAsia="Microsoft YaHei"/>
+                <w:rFonts w:ascii="Times New Roman" w:hAnsi="Times New Roman" w:eastAsia="SimSun"/>
                 <w:b w:val="0"/>
-                <w:sz w:val="20"/>
+                <w:sz w:val="19"/>
               </w:rPr>
-              <w:t>Decorator / QA / Optimizer</w:t>
+              <w:t>Exporter</w:t>
             </w:r>
           </w:p>
         </w:tc>
         <w:tc>
           <w:tcPr>
-            <w:tcW w:type="dxa" w:w="3120"/>
+            <w:tcW w:type="dxa" w:w="4680"/>
             <w:vAlign w:val="center"/>
           </w:tcPr>
           <w:p>
             <w:pPr>
               <w:spacing w:after="0"/>
+              <w:ind w:firstLine="0"/>
+              <w:jc w:val="left"/>
             </w:pPr>
             <w:r>
               <w:rPr>
-                <w:rFonts w:ascii="Calibri" w:hAnsi="Calibri" w:eastAsia="Microsoft YaHei"/>
+                <w:rFonts w:ascii="Times New Roman" w:hAnsi="Times New Roman" w:eastAsia="SimSun"/>
                 <w:b w:val="0"/>
-                <w:sz w:val="20"/>
+                <w:sz w:val="19"/>
               </w:rPr>
-              <w:t>写入内饰、校验质量、压缩命令并导出数据包</w:t>
+              <w:t>输出 blueprint.json、mcfunction 和可安装 datapack</w:t>
             </w:r>
           </w:p>
         </w:tc>
@@ -500,56 +613,109 @@
         <w:pStyle w:val="Heading1"/>
       </w:pPr>
       <w:r>
-        <w:t>3. 多智能体流程</w:t>
-      </w:r>
-    </w:p>
-    <w:p>
-      <w:r>
-        <w:rPr>
-          <w:rFonts w:ascii="Calibri" w:hAnsi="Calibri" w:eastAsia="Microsoft YaHei"/>
-        </w:rPr>
-        <w:t>当前主流程位于 src/construction/workflow.js，围绕 construction_method_v1 展开。用户输入首先被解析为 buildSpec；随后 ArchitectAgent 生成建筑外壳语义，MaterialPaletteAgent 校验并扩展 Minecraft 1.21.1 方块材料，PlannerAgent 生成房间节点和连通边，CreativeDesignAgent 决定体块变体、屋顶、立面和场地策略。</w:t>
-      </w:r>
-    </w:p>
-    <w:p>
-      <w:r>
-        <w:rPr>
-          <w:rFonts w:ascii="Calibri" w:hAnsi="Calibri" w:eastAsia="Microsoft YaHei"/>
-        </w:rPr>
-        <w:t>后半段由本地几何与装饰模块完成。CSGBuilder 生成空心外壳，BSPPartitioner 切分室内房间，AStarPathfinder 打通门洞和楼梯。InteriorDetailAgent 与 DecoratorAgent 负责家具、灯光、植物、地毯和功能台面。最后，BlueprintQAAgent、ConstraintRepairAgent、TemplateLawAutoRepairAgent 和 BlueprintOptimizerAgent 检查可达性、材料合法性、模板法则覆盖和命令数量。</w:t>
+        <w:t>3 方法</w:t>
       </w:r>
     </w:p>
     <w:p>
       <w:pPr>
-        <w:pStyle w:val="ListBullet"/>
+        <w:pStyle w:val="Heading2"/>
       </w:pPr>
       <w:r>
-        <w:rPr>
-          <w:rFonts w:ascii="Calibri" w:hAnsi="Calibri" w:eastAsia="Microsoft YaHei"/>
-        </w:rPr>
-        <w:t>LLM 只输出 JSON：降低坐标幻觉和非法命令风险。</w:t>
+        <w:t>3.1 语义智能体分工</w:t>
       </w:r>
     </w:p>
     <w:p>
       <w:pPr>
-        <w:pStyle w:val="ListBullet"/>
+        <w:ind w:firstLine="440"/>
+        <w:jc w:val="both"/>
       </w:pPr>
       <w:r>
         <w:rPr>
-          <w:rFonts w:ascii="Calibri" w:hAnsi="Calibri" w:eastAsia="Microsoft YaHei"/>
+          <w:rFonts w:ascii="Times New Roman" w:hAnsi="Times New Roman" w:eastAsia="SimSun"/>
+          <w:sz w:val="22"/>
         </w:rPr>
-        <w:t>本地几何保证结构：外壳、房间、门洞、楼梯由程序计算。</w:t>
+        <w:t>主流程位于 construction_method_v1。用户输入首先被解析为 buildSpec，随后 ArchitectAgent 生成外壳语义，MaterialPaletteAgent 基于 Minecraft Java 1.21.1 方块目录校验材料，PlannerAgent 生成房间节点与连通边，CreativeDesignAgent 决定体块变体、平面排序、屋顶、立面和场地策略。</w:t>
       </w:r>
     </w:p>
     <w:p>
       <w:pPr>
-        <w:pStyle w:val="ListBullet"/>
+        <w:ind w:firstLine="440"/>
+        <w:jc w:val="both"/>
       </w:pPr>
       <w:r>
         <w:rPr>
-          <w:rFonts w:ascii="Calibri" w:hAnsi="Calibri" w:eastAsia="Microsoft YaHei"/>
+          <w:rFonts w:ascii="Times New Roman" w:hAnsi="Times New Roman" w:eastAsia="SimSun"/>
+          <w:sz w:val="22"/>
         </w:rPr>
-        <w:t>导出物完整：每次运行生成 blueprint.json、datapack、raw_build.mcfunction、preview.html 和 run_report.md。</w:t>
+        <w:t>后续智能体继续细化建筑表现。StructureAgent 给出支撑和荷载路径语义，FacadeAgent、RoofAgent、SiteLandscapeAgent 分别规划立面、屋顶和场地，InteriorDetailAgent 与 DecoratorAgent 负责房间级家具、灯光、植物和功能台面。整个过程中，LLM 的输出被约束为 JSON 语义对象，而不是直接写入坐标命令。</w:t>
+      </w:r>
+    </w:p>
+    <w:p>
+      <w:pPr>
+        <w:pStyle w:val="Heading2"/>
+      </w:pPr>
+      <w:r>
+        <w:t>3.2 确定性几何落地</w:t>
+      </w:r>
+    </w:p>
+    <w:p>
+      <w:pPr>
+        <w:ind w:firstLine="440"/>
+        <w:jc w:val="both"/>
+      </w:pPr>
+      <w:r>
+        <w:rPr>
+          <w:rFonts w:ascii="Times New Roman" w:hAnsi="Times New Roman" w:eastAsia="SimSun"/>
+          <w:sz w:val="22"/>
+        </w:rPr>
+        <w:t>几何层是系统稳定性的关键。CSGBuilder 将主体、侧翼、门廊、塔楼等语义体块合并为稀疏 voxel 网格，并抽取外表面、楼板、屋顶和开窗。BSPPartitioner 根据楼层功能和房间权重划分室内空间；AStarPathfinder 根据拓扑关系生成门洞、楼梯和可通行路径。这样可以避免 LLM 直接坐标生成中的穿墙、断路和房间重叠问题。</w:t>
+      </w:r>
+    </w:p>
+    <w:p>
+      <w:pPr>
+        <w:ind w:firstLine="440"/>
+        <w:jc w:val="both"/>
+      </w:pPr>
+      <w:r>
+        <w:rPr>
+          <w:rFonts w:ascii="Times New Roman" w:hAnsi="Times New Roman" w:eastAsia="SimSun"/>
+          <w:sz w:val="22"/>
+        </w:rPr>
+        <w:t>导出层将最终网格转换为 Minecraft 数据包。玩家复制 architect_datapack 到世界 datapacks 目录后，执行 /reload 和 /function architect:run 即可触发 clear + build。系统同时输出 preview.html 和 run_report.md，便于不进入游戏时检查结构、流程和统计信息。</w:t>
+      </w:r>
+    </w:p>
+    <w:p>
+      <w:pPr>
+        <w:pStyle w:val="Heading2"/>
+      </w:pPr>
+      <w:r>
+        <w:t>3.3 模板语料学习</w:t>
+      </w:r>
+    </w:p>
+    <w:p>
+      <w:pPr>
+        <w:ind w:firstLine="440"/>
+        <w:jc w:val="both"/>
+      </w:pPr>
+      <w:r>
+        <w:rPr>
+          <w:rFonts w:ascii="Times New Roman" w:hAnsi="Times New Roman" w:eastAsia="SimSun"/>
+          <w:sz w:val="22"/>
+        </w:rPr>
+        <w:t>项目后期加入 mc_templates 下的 64 个本地 schematic 模板。我们没有把模板用作方块级复制库，而是将其分析为可迁移的设计语法，包括场地入口、前景花园、体块轮廓、屋顶语言、立面深度和室内场景。生成时，TemplateKnowledgeAgent 检索相关案例，CreativeDesignAgent 和 Site、Roof、Facade、Interior 模块再使用这些语法。</w:t>
+      </w:r>
+    </w:p>
+    <w:p>
+      <w:pPr>
+        <w:ind w:firstLine="440"/>
+        <w:jc w:val="both"/>
+      </w:pPr>
+      <w:r>
+        <w:rPr>
+          <w:rFonts w:ascii="Times New Roman" w:hAnsi="Times New Roman" w:eastAsia="SimSun"/>
+          <w:sz w:val="22"/>
+        </w:rPr>
+        <w:t>为降低抄袭风险，系统记录 source_fusion_policy，要求多来源融合并控制单一来源占比。模板法则覆盖、审美审计和自动修复机制构成了后期质量闭环，使建筑不只满足“能生成”，还尝试拥有可解释的风格来源和设计一致性。</w:t>
       </w:r>
     </w:p>
     <w:p>
@@ -557,82 +723,162 @@
         <w:pStyle w:val="Heading1"/>
       </w:pPr>
       <w:r>
-        <w:t>4. 几何落地与 Minecraft 数据包</w:t>
+        <w:t>4 实现过程与构思迭代</w:t>
       </w:r>
     </w:p>
     <w:p>
+      <w:pPr>
+        <w:ind w:firstLine="440"/>
+        <w:jc w:val="both"/>
+      </w:pPr>
       <w:r>
         <w:rPr>
-          <w:rFonts w:ascii="Calibri" w:hAnsi="Calibri" w:eastAsia="Microsoft YaHei"/>
+          <w:rFonts w:ascii="Times New Roman" w:hAnsi="Times New Roman" w:eastAsia="SimSun"/>
+          <w:sz w:val="22"/>
         </w:rPr>
-        <w:t>几何层是项目中工作量较大的部分。CSGBuilder 将主体、侧翼、门廊、塔楼等语义体块合并为稀疏 voxel 网格，并抽取外表面、楼板、屋顶和窗。BSPPartitioner 根据房间权重和楼层功能切分内部空间，AStarPathfinder 根据拓扑关系生成门洞和楼梯。这样可以避免 LLM 直接生成坐标时常见的穿墙、断路和房间重叠问题。</w:t>
+        <w:t>项目的主要工作并不是一次性写出最终架构，而是在多轮实现中逐步修改问题定义。2026 年 5 月 28 日的初始版本建立了 Minecraft architect agent，并加入自动安装世界与建造模式；6 月 2 日，蓝图生成被拆分为多个子智能体；6 月 9 日，项目加入语义规划层和多智能体建筑技能；6 月 17 日前后，construction_method_v1 基本成型；6 月 18 日至 19 日，模板语料、schematic 分析、设计法则、审美审计、自动修复和候选择优陆续接入主流程。</w:t>
       </w:r>
     </w:p>
     <w:p>
+      <w:pPr>
+        <w:ind w:firstLine="440"/>
+        <w:jc w:val="both"/>
+      </w:pPr>
       <w:r>
         <w:rPr>
-          <w:rFonts w:ascii="Calibri" w:hAnsi="Calibri" w:eastAsia="Microsoft YaHei"/>
+          <w:rFonts w:ascii="Times New Roman" w:hAnsi="Times New Roman" w:eastAsia="SimSun"/>
+          <w:sz w:val="22"/>
         </w:rPr>
-        <w:t>导出层会把方块网格转换成 Minecraft 1.21 数据包。数据包入口为 data/architect/function/run.mcfunction，玩家在游戏中执行 /reload 后，再执行 /function architect:run 即可触发 clear + build。系统还会输出 raw_build.mcfunction 和 preview.html，方便不打开游戏时检查结构。</w:t>
+        <w:t>这些变化反映了项目构思的转向。最初我们关注“如何生成一个房子”，后来逐步意识到课程项目更需要展示智能体系统如何分工、如何约束大模型、如何把开放语义落地为可靠工程产物。因此，系统从 prompt 驱动的单点生成，转向多 Agent 分工、语义 JSON、本地几何、模板知识和质量闭环。</w:t>
       </w:r>
     </w:p>
     <w:p>
+      <w:pPr>
+        <w:pStyle w:val="Heading1"/>
+      </w:pPr>
+      <w:r>
+        <w:t>5 实验与结果</w:t>
+      </w:r>
+    </w:p>
+    <w:p>
+      <w:pPr>
+        <w:ind w:firstLine="440"/>
+        <w:jc w:val="both"/>
+      </w:pPr>
       <w:r>
         <w:rPr>
-          <w:rFonts w:ascii="Calibri" w:hAnsi="Calibri" w:eastAsia="Microsoft YaHei"/>
+          <w:rFonts w:ascii="Times New Roman" w:hAnsi="Times New Roman" w:eastAsia="SimSun"/>
+          <w:sz w:val="22"/>
         </w:rPr>
-        <w:t>以本地样例 out/2026-06-19-145532212 为例，run_report.md 记录的建筑尺寸为 43 x 16 x 57，房间可达性为 14/14，QA 为 9/9 项通过，装饰数量为 819 个。Exporter 将朴素命令 2692 条压缩到 1251 条，压缩倍率约 2.15x。这些统计说明系统不只是生成一段文本，而是在输出前做了结构、材料、连通和命令层面的检查。</w:t>
+        <w:t>当前全量测试为 176 项通过、0 项失败，其中包括课程提交文档测试；原项目功能基线为 173 项通过、0 项失败。测试覆盖 Architect fallback、Planner、CSG、BSP、A*、Decorator、模板法则、候选择优、LLM provider、材料目录和可视化输出等模块。</w:t>
+      </w:r>
+    </w:p>
+    <w:p>
+      <w:pPr>
+        <w:ind w:firstLine="440"/>
+        <w:jc w:val="both"/>
+      </w:pPr>
+      <w:r>
+        <w:rPr>
+          <w:rFonts w:ascii="Times New Roman" w:hAnsi="Times New Roman" w:eastAsia="SimSun"/>
+          <w:sz w:val="22"/>
+        </w:rPr>
+        <w:t>本地样例 out/2026-06-19-145532212 使用 prompt“建造一个木屋别墅”。run_report.md 记录了 LLM 调用状态、seed、几何统计、装饰数量、模板法则覆盖、QA 状态和 Minecraft 使用步骤。该样例说明系统并非只生成文本，而是在输出前经过结构、材料、连通和命令层面的检查。</w:t>
+      </w:r>
+    </w:p>
+    <w:p>
+      <w:pPr>
+        <w:spacing w:before="80" w:after="80"/>
+        <w:ind w:firstLine="0"/>
+        <w:jc w:val="center"/>
+      </w:pPr>
+      <w:r>
+        <w:rPr>
+          <w:rFonts w:ascii="Times New Roman" w:hAnsi="Times New Roman" w:eastAsia="SimSun"/>
+          <w:b/>
+          <w:sz w:val="21"/>
+        </w:rPr>
+        <w:t>表 2 本地样例运行结果</w:t>
       </w:r>
     </w:p>
     <w:tbl>
       <w:tblPr>
         <w:tblStyle w:val="TableGrid"/>
-        <w:tblW w:type="auto" w:w="0"/>
+        <w:tblW w:type="dxa" w:w="9360"/>
         <w:jc w:val="center"/>
+        <w:tblLayout w:type="fixed"/>
         <w:tblLook w:firstColumn="1" w:firstRow="1" w:lastColumn="0" w:lastRow="0" w:noHBand="0" w:noVBand="1" w:val="04A0"/>
+        <w:tblInd w:type="dxa" w:w="120"/>
       </w:tblPr>
       <w:tblGrid>
-        <w:gridCol w:w="4680"/>
-        <w:gridCol w:w="4680"/>
+        <w:gridCol w:w="2160"/>
+        <w:gridCol w:w="2376"/>
+        <w:gridCol w:w="4824"/>
       </w:tblGrid>
       <w:tr>
         <w:tc>
           <w:tcPr>
-            <w:tcW w:type="dxa" w:w="4680"/>
+            <w:tcW w:type="dxa" w:w="2160"/>
             <w:vAlign w:val="center"/>
-            <w:shd w:fill="F2F4F7"/>
+            <w:shd w:fill="F2F2F2"/>
           </w:tcPr>
           <w:p>
             <w:pPr>
               <w:spacing w:after="0"/>
+              <w:ind w:firstLine="0"/>
+              <w:jc w:val="center"/>
             </w:pPr>
             <w:r>
               <w:rPr>
-                <w:rFonts w:ascii="Calibri" w:hAnsi="Calibri" w:eastAsia="Microsoft YaHei"/>
+                <w:rFonts w:ascii="Times New Roman" w:hAnsi="Times New Roman" w:eastAsia="SimSun"/>
                 <w:b/>
-                <w:sz w:val="20"/>
+                <w:sz w:val="19"/>
               </w:rPr>
-              <w:t>输出文件</w:t>
+              <w:t>指标</w:t>
             </w:r>
           </w:p>
         </w:tc>
         <w:tc>
           <w:tcPr>
-            <w:tcW w:type="dxa" w:w="4680"/>
+            <w:tcW w:type="dxa" w:w="2376"/>
             <w:vAlign w:val="center"/>
-            <w:shd w:fill="F2F4F7"/>
+            <w:shd w:fill="F2F2F2"/>
           </w:tcPr>
           <w:p>
             <w:pPr>
               <w:spacing w:after="0"/>
+              <w:ind w:firstLine="0"/>
+              <w:jc w:val="center"/>
             </w:pPr>
             <w:r>
               <w:rPr>
-                <w:rFonts w:ascii="Calibri" w:hAnsi="Calibri" w:eastAsia="Microsoft YaHei"/>
+                <w:rFonts w:ascii="Times New Roman" w:hAnsi="Times New Roman" w:eastAsia="SimSun"/>
                 <w:b/>
-                <w:sz w:val="20"/>
+                <w:sz w:val="19"/>
               </w:rPr>
-              <w:t>用途</w:t>
+              <w:t>结果</w:t>
+            </w:r>
+          </w:p>
+        </w:tc>
+        <w:tc>
+          <w:tcPr>
+            <w:tcW w:type="dxa" w:w="4824"/>
+            <w:vAlign w:val="center"/>
+            <w:shd w:fill="F2F2F2"/>
+          </w:tcPr>
+          <w:p>
+            <w:pPr>
+              <w:spacing w:after="0"/>
+              <w:ind w:firstLine="0"/>
+              <w:jc w:val="left"/>
+            </w:pPr>
+            <w:r>
+              <w:rPr>
+                <w:rFonts w:ascii="Times New Roman" w:hAnsi="Times New Roman" w:eastAsia="SimSun"/>
+                <w:b/>
+                <w:sz w:val="19"/>
+              </w:rPr>
+              <w:t>说明</w:t>
             </w:r>
           </w:p>
         </w:tc>
@@ -640,39 +886,64 @@
       <w:tr>
         <w:tc>
           <w:tcPr>
-            <w:tcW w:type="dxa" w:w="4680"/>
+            <w:tcW w:type="dxa" w:w="2160"/>
             <w:vAlign w:val="center"/>
           </w:tcPr>
           <w:p>
             <w:pPr>
               <w:spacing w:after="0"/>
+              <w:ind w:firstLine="0"/>
+              <w:jc w:val="center"/>
             </w:pPr>
             <w:r>
               <w:rPr>
-                <w:rFonts w:ascii="Calibri" w:hAnsi="Calibri" w:eastAsia="Microsoft YaHei"/>
+                <w:rFonts w:ascii="Times New Roman" w:hAnsi="Times New Roman" w:eastAsia="SimSun"/>
                 <w:b w:val="0"/>
-                <w:sz w:val="20"/>
+                <w:sz w:val="19"/>
               </w:rPr>
-              <w:t>blueprint.json</w:t>
+              <w:t>建筑尺寸</w:t>
             </w:r>
           </w:p>
         </w:tc>
         <w:tc>
           <w:tcPr>
-            <w:tcW w:type="dxa" w:w="4680"/>
+            <w:tcW w:type="dxa" w:w="2376"/>
             <w:vAlign w:val="center"/>
           </w:tcPr>
           <w:p>
             <w:pPr>
               <w:spacing w:after="0"/>
+              <w:ind w:firstLine="0"/>
+              <w:jc w:val="center"/>
             </w:pPr>
             <w:r>
               <w:rPr>
-                <w:rFonts w:ascii="Calibri" w:hAnsi="Calibri" w:eastAsia="Microsoft YaHei"/>
+                <w:rFonts w:ascii="Times New Roman" w:hAnsi="Times New Roman" w:eastAsia="SimSun"/>
                 <w:b w:val="0"/>
-                <w:sz w:val="20"/>
+                <w:sz w:val="19"/>
               </w:rPr>
-              <w:t>保存 prompt、seed、Agent 输出、几何统计、房间、装饰和校验结果</w:t>
+              <w:t>43 x 16 x 57</w:t>
+            </w:r>
+          </w:p>
+        </w:tc>
+        <w:tc>
+          <w:tcPr>
+            <w:tcW w:type="dxa" w:w="4824"/>
+            <w:vAlign w:val="center"/>
+          </w:tcPr>
+          <w:p>
+            <w:pPr>
+              <w:spacing w:after="0"/>
+              <w:ind w:firstLine="0"/>
+              <w:jc w:val="left"/>
+            </w:pPr>
+            <w:r>
+              <w:rPr>
+                <w:rFonts w:ascii="Times New Roman" w:hAnsi="Times New Roman" w:eastAsia="SimSun"/>
+                <w:b w:val="0"/>
+                <w:sz w:val="19"/>
+              </w:rPr>
+              <w:t>来自 run_report.md 的几何校验结果</w:t>
             </w:r>
           </w:p>
         </w:tc>
@@ -680,39 +951,64 @@
       <w:tr>
         <w:tc>
           <w:tcPr>
-            <w:tcW w:type="dxa" w:w="4680"/>
+            <w:tcW w:type="dxa" w:w="2160"/>
             <w:vAlign w:val="center"/>
           </w:tcPr>
           <w:p>
             <w:pPr>
               <w:spacing w:after="0"/>
+              <w:ind w:firstLine="0"/>
+              <w:jc w:val="center"/>
             </w:pPr>
             <w:r>
               <w:rPr>
-                <w:rFonts w:ascii="Calibri" w:hAnsi="Calibri" w:eastAsia="Microsoft YaHei"/>
+                <w:rFonts w:ascii="Times New Roman" w:hAnsi="Times New Roman" w:eastAsia="SimSun"/>
                 <w:b w:val="0"/>
-                <w:sz w:val="20"/>
+                <w:sz w:val="19"/>
               </w:rPr>
-              <w:t>architect_datapack/</w:t>
+              <w:t>房间可达性</w:t>
             </w:r>
           </w:p>
         </w:tc>
         <w:tc>
           <w:tcPr>
-            <w:tcW w:type="dxa" w:w="4680"/>
+            <w:tcW w:type="dxa" w:w="2376"/>
             <w:vAlign w:val="center"/>
           </w:tcPr>
           <w:p>
             <w:pPr>
               <w:spacing w:after="0"/>
+              <w:ind w:firstLine="0"/>
+              <w:jc w:val="center"/>
             </w:pPr>
             <w:r>
               <w:rPr>
-                <w:rFonts w:ascii="Calibri" w:hAnsi="Calibri" w:eastAsia="Microsoft YaHei"/>
+                <w:rFonts w:ascii="Times New Roman" w:hAnsi="Times New Roman" w:eastAsia="SimSun"/>
                 <w:b w:val="0"/>
-                <w:sz w:val="20"/>
+                <w:sz w:val="19"/>
               </w:rPr>
-              <w:t>可复制到 Minecraft 世界 datapacks 目录的完整数据包</w:t>
+              <w:t>14/14</w:t>
+            </w:r>
+          </w:p>
+        </w:tc>
+        <w:tc>
+          <w:tcPr>
+            <w:tcW w:type="dxa" w:w="4824"/>
+            <w:vAlign w:val="center"/>
+          </w:tcPr>
+          <w:p>
+            <w:pPr>
+              <w:spacing w:after="0"/>
+              <w:ind w:firstLine="0"/>
+              <w:jc w:val="left"/>
+            </w:pPr>
+            <w:r>
+              <w:rPr>
+                <w:rFonts w:ascii="Times New Roman" w:hAnsi="Times New Roman" w:eastAsia="SimSun"/>
+                <w:b w:val="0"/>
+                <w:sz w:val="19"/>
+              </w:rPr>
+              <w:t>入口可达房间全部通过</w:t>
             </w:r>
           </w:p>
         </w:tc>
@@ -720,39 +1016,64 @@
       <w:tr>
         <w:tc>
           <w:tcPr>
-            <w:tcW w:type="dxa" w:w="4680"/>
+            <w:tcW w:type="dxa" w:w="2160"/>
             <w:vAlign w:val="center"/>
           </w:tcPr>
           <w:p>
             <w:pPr>
               <w:spacing w:after="0"/>
+              <w:ind w:firstLine="0"/>
+              <w:jc w:val="center"/>
             </w:pPr>
             <w:r>
               <w:rPr>
-                <w:rFonts w:ascii="Calibri" w:hAnsi="Calibri" w:eastAsia="Microsoft YaHei"/>
+                <w:rFonts w:ascii="Times New Roman" w:hAnsi="Times New Roman" w:eastAsia="SimSun"/>
                 <w:b w:val="0"/>
-                <w:sz w:val="20"/>
+                <w:sz w:val="19"/>
               </w:rPr>
-              <w:t>preview.html</w:t>
+              <w:t>QA 检查</w:t>
             </w:r>
           </w:p>
         </w:tc>
         <w:tc>
           <w:tcPr>
-            <w:tcW w:type="dxa" w:w="4680"/>
+            <w:tcW w:type="dxa" w:w="2376"/>
             <w:vAlign w:val="center"/>
           </w:tcPr>
           <w:p>
             <w:pPr>
               <w:spacing w:after="0"/>
+              <w:ind w:firstLine="0"/>
+              <w:jc w:val="center"/>
             </w:pPr>
             <w:r>
               <w:rPr>
-                <w:rFonts w:ascii="Calibri" w:hAnsi="Calibri" w:eastAsia="Microsoft YaHei"/>
+                <w:rFonts w:ascii="Times New Roman" w:hAnsi="Times New Roman" w:eastAsia="SimSun"/>
                 <w:b w:val="0"/>
-                <w:sz w:val="20"/>
+                <w:sz w:val="19"/>
               </w:rPr>
-              <w:t>本地浏览器中的静态平面和阶段预览</w:t>
+              <w:t>9/9</w:t>
+            </w:r>
+          </w:p>
+        </w:tc>
+        <w:tc>
+          <w:tcPr>
+            <w:tcW w:type="dxa" w:w="4824"/>
+            <w:vAlign w:val="center"/>
+          </w:tcPr>
+          <w:p>
+            <w:pPr>
+              <w:spacing w:after="0"/>
+              <w:ind w:firstLine="0"/>
+              <w:jc w:val="left"/>
+            </w:pPr>
+            <w:r>
+              <w:rPr>
+                <w:rFonts w:ascii="Times New Roman" w:hAnsi="Times New Roman" w:eastAsia="SimSun"/>
+                <w:b w:val="0"/>
+                <w:sz w:val="19"/>
+              </w:rPr>
+              <w:t>结构、材料、入口和装饰检查通过</w:t>
             </w:r>
           </w:p>
         </w:tc>
@@ -760,39 +1081,194 @@
       <w:tr>
         <w:tc>
           <w:tcPr>
-            <w:tcW w:type="dxa" w:w="4680"/>
+            <w:tcW w:type="dxa" w:w="2160"/>
             <w:vAlign w:val="center"/>
           </w:tcPr>
           <w:p>
             <w:pPr>
               <w:spacing w:after="0"/>
+              <w:ind w:firstLine="0"/>
+              <w:jc w:val="center"/>
             </w:pPr>
             <w:r>
               <w:rPr>
-                <w:rFonts w:ascii="Calibri" w:hAnsi="Calibri" w:eastAsia="Microsoft YaHei"/>
+                <w:rFonts w:ascii="Times New Roman" w:hAnsi="Times New Roman" w:eastAsia="SimSun"/>
                 <w:b w:val="0"/>
-                <w:sz w:val="20"/>
+                <w:sz w:val="19"/>
               </w:rPr>
-              <w:t>run_report.md</w:t>
+              <w:t>装饰数量</w:t>
             </w:r>
           </w:p>
         </w:tc>
         <w:tc>
           <w:tcPr>
-            <w:tcW w:type="dxa" w:w="4680"/>
+            <w:tcW w:type="dxa" w:w="2376"/>
             <w:vAlign w:val="center"/>
           </w:tcPr>
           <w:p>
             <w:pPr>
               <w:spacing w:after="0"/>
+              <w:ind w:firstLine="0"/>
+              <w:jc w:val="center"/>
             </w:pPr>
             <w:r>
               <w:rPr>
-                <w:rFonts w:ascii="Calibri" w:hAnsi="Calibri" w:eastAsia="Microsoft YaHei"/>
+                <w:rFonts w:ascii="Times New Roman" w:hAnsi="Times New Roman" w:eastAsia="SimSun"/>
                 <w:b w:val="0"/>
-                <w:sz w:val="20"/>
+                <w:sz w:val="19"/>
               </w:rPr>
-              <w:t>记录本次生成流程、LLM 使用情况、几何统计和使用步骤</w:t>
+              <w:t>819</w:t>
+            </w:r>
+          </w:p>
+        </w:tc>
+        <w:tc>
+          <w:tcPr>
+            <w:tcW w:type="dxa" w:w="4824"/>
+            <w:vAlign w:val="center"/>
+          </w:tcPr>
+          <w:p>
+            <w:pPr>
+              <w:spacing w:after="0"/>
+              <w:ind w:firstLine="0"/>
+              <w:jc w:val="left"/>
+            </w:pPr>
+            <w:r>
+              <w:rPr>
+                <w:rFonts w:ascii="Times New Roman" w:hAnsi="Times New Roman" w:eastAsia="SimSun"/>
+                <w:b w:val="0"/>
+                <w:sz w:val="19"/>
+              </w:rPr>
+              <w:t>由室内与风格装饰模块写入</w:t>
+            </w:r>
+          </w:p>
+        </w:tc>
+      </w:tr>
+      <w:tr>
+        <w:tc>
+          <w:tcPr>
+            <w:tcW w:type="dxa" w:w="2160"/>
+            <w:vAlign w:val="center"/>
+          </w:tcPr>
+          <w:p>
+            <w:pPr>
+              <w:spacing w:after="0"/>
+              <w:ind w:firstLine="0"/>
+              <w:jc w:val="center"/>
+            </w:pPr>
+            <w:r>
+              <w:rPr>
+                <w:rFonts w:ascii="Times New Roman" w:hAnsi="Times New Roman" w:eastAsia="SimSun"/>
+                <w:b w:val="0"/>
+                <w:sz w:val="19"/>
+              </w:rPr>
+              <w:t>命令压缩</w:t>
+            </w:r>
+          </w:p>
+        </w:tc>
+        <w:tc>
+          <w:tcPr>
+            <w:tcW w:type="dxa" w:w="2376"/>
+            <w:vAlign w:val="center"/>
+          </w:tcPr>
+          <w:p>
+            <w:pPr>
+              <w:spacing w:after="0"/>
+              <w:ind w:firstLine="0"/>
+              <w:jc w:val="center"/>
+            </w:pPr>
+            <w:r>
+              <w:rPr>
+                <w:rFonts w:ascii="Times New Roman" w:hAnsi="Times New Roman" w:eastAsia="SimSun"/>
+                <w:b w:val="0"/>
+                <w:sz w:val="19"/>
+              </w:rPr>
+              <w:t>2692 -&gt; 1251</w:t>
+            </w:r>
+          </w:p>
+        </w:tc>
+        <w:tc>
+          <w:tcPr>
+            <w:tcW w:type="dxa" w:w="4824"/>
+            <w:vAlign w:val="center"/>
+          </w:tcPr>
+          <w:p>
+            <w:pPr>
+              <w:spacing w:after="0"/>
+              <w:ind w:firstLine="0"/>
+              <w:jc w:val="left"/>
+            </w:pPr>
+            <w:r>
+              <w:rPr>
+                <w:rFonts w:ascii="Times New Roman" w:hAnsi="Times New Roman" w:eastAsia="SimSun"/>
+                <w:b w:val="0"/>
+                <w:sz w:val="19"/>
+              </w:rPr>
+              <w:t>压缩倍率约 2.15x，降低数据包函数体积</w:t>
+            </w:r>
+          </w:p>
+        </w:tc>
+      </w:tr>
+      <w:tr>
+        <w:tc>
+          <w:tcPr>
+            <w:tcW w:type="dxa" w:w="2160"/>
+            <w:vAlign w:val="center"/>
+          </w:tcPr>
+          <w:p>
+            <w:pPr>
+              <w:spacing w:after="0"/>
+              <w:ind w:firstLine="0"/>
+              <w:jc w:val="center"/>
+            </w:pPr>
+            <w:r>
+              <w:rPr>
+                <w:rFonts w:ascii="Times New Roman" w:hAnsi="Times New Roman" w:eastAsia="SimSun"/>
+                <w:b w:val="0"/>
+                <w:sz w:val="19"/>
+              </w:rPr>
+              <w:t>模板法则覆盖</w:t>
+            </w:r>
+          </w:p>
+        </w:tc>
+        <w:tc>
+          <w:tcPr>
+            <w:tcW w:type="dxa" w:w="2376"/>
+            <w:vAlign w:val="center"/>
+          </w:tcPr>
+          <w:p>
+            <w:pPr>
+              <w:spacing w:after="0"/>
+              <w:ind w:firstLine="0"/>
+              <w:jc w:val="center"/>
+            </w:pPr>
+            <w:r>
+              <w:rPr>
+                <w:rFonts w:ascii="Times New Roman" w:hAnsi="Times New Roman" w:eastAsia="SimSun"/>
+                <w:b w:val="0"/>
+                <w:sz w:val="19"/>
+              </w:rPr>
+              <w:t>100%</w:t>
+            </w:r>
+          </w:p>
+        </w:tc>
+        <w:tc>
+          <w:tcPr>
+            <w:tcW w:type="dxa" w:w="4824"/>
+            <w:vAlign w:val="center"/>
+          </w:tcPr>
+          <w:p>
+            <w:pPr>
+              <w:spacing w:after="0"/>
+              <w:ind w:firstLine="0"/>
+              <w:jc w:val="left"/>
+            </w:pPr>
+            <w:r>
+              <w:rPr>
+                <w:rFonts w:ascii="Times New Roman" w:hAnsi="Times New Roman" w:eastAsia="SimSun"/>
+                <w:b w:val="0"/>
+                <w:sz w:val="19"/>
+              </w:rPr>
+              <w:t>TemplateLawAutoRepairAgent 补强后达到 law-perfect</w:t>
             </w:r>
           </w:p>
         </w:tc>
@@ -804,64 +1280,33 @@
         <w:pStyle w:val="Heading1"/>
       </w:pPr>
       <w:r>
-        <w:t>5. 模板语料学习：把参考建筑变成设计语法</w:t>
-      </w:r>
-    </w:p>
-    <w:p>
-      <w:r>
-        <w:rPr>
-          <w:rFonts w:ascii="Calibri" w:hAnsi="Calibri" w:eastAsia="Microsoft YaHei"/>
-        </w:rPr>
-        <w:t>项目后期加入了 mc_templates/ 下的本地 schematic 语料，共 64 个模板，覆盖住宅、城堡、塔楼、寺庙、竞技场和公共建筑等类型。我们没有把模板当成方块级复制库，而是把它们分析为可迁移的设计语法：场地入口、前景花园、体块轮廓、屋顶语言、立面深度和室内场景。</w:t>
-      </w:r>
-    </w:p>
-    <w:p>
-      <w:r>
-        <w:rPr>
-          <w:rFonts w:ascii="Calibri" w:hAnsi="Calibri" w:eastAsia="Microsoft YaHei"/>
-        </w:rPr>
-        <w:t>模板分析会生成案例库、语义条款、设计法则和检索索引。生成时，TemplateKnowledgeAgent 结合用户 prompt 检索相关参考，CreativeDesignAgent 和 Site/Roof/Facade/Interior 等模块再使用这些语法。为降低抄袭风险，系统记录 source_fusion_policy，要求多来源融合、控制单一来源占比，并将大型纪念性模板归一化到住宅尺度。</w:t>
-      </w:r>
-    </w:p>
-    <w:p>
-      <w:r>
-        <w:rPr>
-          <w:rFonts w:ascii="Calibri" w:hAnsi="Calibri" w:eastAsia="Microsoft YaHei"/>
-        </w:rPr>
-        <w:t>这一阶段也促使我们修改了项目目标：系统不再只追求“有墙、有屋顶”，而是尝试让建筑拥有场地关系、入口序列、立面深度、屋顶语言和室内生活场景。docs/template-assimilation-plan.md 中记录的最终回归结果显示，36 个模板吸收 prompt 均成功生成，平均 template audit 和 law coverage 达到 100%。自动评分不能完全代表视觉审美，但它能证明模板知识链路已经接入主流程。</w:t>
+        <w:t>6 讨论</w:t>
       </w:r>
     </w:p>
     <w:p>
       <w:pPr>
-        <w:pStyle w:val="ListBullet"/>
+        <w:ind w:firstLine="440"/>
+        <w:jc w:val="both"/>
       </w:pPr>
       <w:r>
         <w:rPr>
-          <w:rFonts w:ascii="Calibri" w:hAnsi="Calibri" w:eastAsia="Microsoft YaHei"/>
+          <w:rFonts w:ascii="Times New Roman" w:hAnsi="Times New Roman" w:eastAsia="SimSun"/>
+          <w:sz w:val="22"/>
         </w:rPr>
-        <w:t>模板数量：64 个本地 schematic，导入错误为 0。</w:t>
+        <w:t>从课程要求看，项目的整体性体现在所有模块都围绕同一条主线协作：中文需求输入、智能体语义决策、本地几何落地、质量检查和数据包导出。项目的创新性主要体现在三点。第一，系统清晰区分 LLM 与程序算法的职责，避免让大模型直接处理坐标和命令。第二，模板语料被抽象为设计语法和审美法则，而不是简单复制。第三，项目保留 mock 兜底和自动化测试，使没有 token 或现场网络时仍能复现完整流程。</w:t>
       </w:r>
     </w:p>
     <w:p>
       <w:pPr>
-        <w:pStyle w:val="ListBullet"/>
+        <w:ind w:firstLine="440"/>
+        <w:jc w:val="both"/>
       </w:pPr>
       <w:r>
         <w:rPr>
-          <w:rFonts w:ascii="Calibri" w:hAnsi="Calibri" w:eastAsia="Microsoft YaHei"/>
+          <w:rFonts w:ascii="Times New Roman" w:hAnsi="Times New Roman" w:eastAsia="SimSun"/>
+          <w:sz w:val="22"/>
         </w:rPr>
-        <w:t>设计法则：包括 site、massing、roof、facade 和 interior 多类语义。</w:t>
-      </w:r>
-    </w:p>
-    <w:p>
-      <w:pPr>
-        <w:pStyle w:val="ListBullet"/>
-      </w:pPr>
-      <w:r>
-        <w:rPr>
-          <w:rFonts w:ascii="Calibri" w:hAnsi="Calibri" w:eastAsia="Microsoft YaHei"/>
-        </w:rPr>
-        <w:t>非复制控制：强调借鉴结构语法，而非 1:1 复制模板。</w:t>
+        <w:t>项目也存在局限。当前版本不是 Mineflayer 实时机器人，也不模拟玩家逐块放置；GDMC HTTP 客户端虽然保留，但主交付仍是数据包导出。自动审美评分可以发现法则覆盖问题，却不能完全替代玩家视角下的尺度、镜头、路径和 block readability 检查。后续可补充真实游戏截图、人工评分样本，以及更严格的视觉相似性和非复制检测。</w:t>
       </w:r>
     </w:p>
     <w:p>
@@ -869,839 +1314,33 @@
         <w:pStyle w:val="Heading1"/>
       </w:pPr>
       <w:r>
-        <w:t>6. 项目迭代与构思修改</w:t>
-      </w:r>
-    </w:p>
-    <w:p>
-      <w:r>
-        <w:rPr>
-          <w:rFonts w:ascii="Calibri" w:hAnsi="Calibri" w:eastAsia="Microsoft YaHei"/>
-        </w:rPr>
-        <w:t>这个项目的重点不只是最终代码量，而是我们在构思中不断修改问题定义。最开始的目标偏向“让智能体建一个 Minecraft 房子”，后来发现如果只是堆 prompt 或直接生成命令，既不稳定，也不容易体现智能体系统的结构。于是项目逐步转向多智能体分工和确定性几何落地。</w:t>
-      </w:r>
-    </w:p>
-    <w:p>
-      <w:r>
-        <w:rPr>
-          <w:rFonts w:ascii="Calibri" w:hAnsi="Calibri" w:eastAsia="Microsoft YaHei"/>
-        </w:rPr>
-        <w:t>Git 历史能看到几个关键阶段：5 月 28 日建立初始 Minecraft architect agent，并加入自动安装世界与建造模式；6 月 2 日拆分蓝图生成子 Agent；6 月 9 日加入语义规划层和多智能体架构；6 月 17 日完成更大规模的 construction_method_v1；6 月 18 日引入模板语料和 schematic 分析；6 月 19 日加入设计法则、审美审计、自动修复、候选择优和最终 README 收束。</w:t>
-      </w:r>
-    </w:p>
-    <w:tbl>
-      <w:tblPr>
-        <w:tblStyle w:val="TableGrid"/>
-        <w:tblW w:type="auto" w:w="0"/>
-        <w:jc w:val="center"/>
-        <w:tblLook w:firstColumn="1" w:firstRow="1" w:lastColumn="0" w:lastRow="0" w:noHBand="0" w:noVBand="1" w:val="04A0"/>
-      </w:tblPr>
-      <w:tblGrid>
-        <w:gridCol w:w="3120"/>
-        <w:gridCol w:w="3120"/>
-        <w:gridCol w:w="3120"/>
-      </w:tblGrid>
-      <w:tr>
-        <w:tc>
-          <w:tcPr>
-            <w:tcW w:type="dxa" w:w="3120"/>
-            <w:vAlign w:val="center"/>
-            <w:shd w:fill="F2F4F7"/>
-          </w:tcPr>
-          <w:p>
-            <w:pPr>
-              <w:spacing w:after="0"/>
-            </w:pPr>
-            <w:r>
-              <w:rPr>
-                <w:rFonts w:ascii="Calibri" w:hAnsi="Calibri" w:eastAsia="Microsoft YaHei"/>
-                <w:b/>
-                <w:sz w:val="20"/>
-              </w:rPr>
-              <w:t>阶段</w:t>
-            </w:r>
-          </w:p>
-        </w:tc>
-        <w:tc>
-          <w:tcPr>
-            <w:tcW w:type="dxa" w:w="3120"/>
-            <w:vAlign w:val="center"/>
-            <w:shd w:fill="F2F4F7"/>
-          </w:tcPr>
-          <w:p>
-            <w:pPr>
-              <w:spacing w:after="0"/>
-            </w:pPr>
-            <w:r>
-              <w:rPr>
-                <w:rFonts w:ascii="Calibri" w:hAnsi="Calibri" w:eastAsia="Microsoft YaHei"/>
-                <w:b/>
-                <w:sz w:val="20"/>
-              </w:rPr>
-              <w:t>主要变化</w:t>
-            </w:r>
-          </w:p>
-        </w:tc>
-        <w:tc>
-          <w:tcPr>
-            <w:tcW w:type="dxa" w:w="3120"/>
-            <w:vAlign w:val="center"/>
-            <w:shd w:fill="F2F4F7"/>
-          </w:tcPr>
-          <w:p>
-            <w:pPr>
-              <w:spacing w:after="0"/>
-            </w:pPr>
-            <w:r>
-              <w:rPr>
-                <w:rFonts w:ascii="Calibri" w:hAnsi="Calibri" w:eastAsia="Microsoft YaHei"/>
-                <w:b/>
-                <w:sz w:val="20"/>
-              </w:rPr>
-              <w:t>背后的取舍</w:t>
-            </w:r>
-          </w:p>
-        </w:tc>
-      </w:tr>
-      <w:tr>
-        <w:tc>
-          <w:tcPr>
-            <w:tcW w:type="dxa" w:w="3120"/>
-            <w:vAlign w:val="center"/>
-          </w:tcPr>
-          <w:p>
-            <w:pPr>
-              <w:spacing w:after="0"/>
-            </w:pPr>
-            <w:r>
-              <w:rPr>
-                <w:rFonts w:ascii="Calibri" w:hAnsi="Calibri" w:eastAsia="Microsoft YaHei"/>
-                <w:b w:val="0"/>
-                <w:sz w:val="20"/>
-              </w:rPr>
-              <w:t>初始版本</w:t>
-            </w:r>
-          </w:p>
-        </w:tc>
-        <w:tc>
-          <w:tcPr>
-            <w:tcW w:type="dxa" w:w="3120"/>
-            <w:vAlign w:val="center"/>
-          </w:tcPr>
-          <w:p>
-            <w:pPr>
-              <w:spacing w:after="0"/>
-            </w:pPr>
-            <w:r>
-              <w:rPr>
-                <w:rFonts w:ascii="Calibri" w:hAnsi="Calibri" w:eastAsia="Microsoft YaHei"/>
-                <w:b w:val="0"/>
-                <w:sz w:val="20"/>
-              </w:rPr>
-              <w:t>自然语言到建筑输出</w:t>
-            </w:r>
-          </w:p>
-        </w:tc>
-        <w:tc>
-          <w:tcPr>
-            <w:tcW w:type="dxa" w:w="3120"/>
-            <w:vAlign w:val="center"/>
-          </w:tcPr>
-          <w:p>
-            <w:pPr>
-              <w:spacing w:after="0"/>
-            </w:pPr>
-            <w:r>
-              <w:rPr>
-                <w:rFonts w:ascii="Calibri" w:hAnsi="Calibri" w:eastAsia="Microsoft YaHei"/>
-                <w:b w:val="0"/>
-                <w:sz w:val="20"/>
-              </w:rPr>
-              <w:t>先建立可运行闭环</w:t>
-            </w:r>
-          </w:p>
-        </w:tc>
-      </w:tr>
-      <w:tr>
-        <w:tc>
-          <w:tcPr>
-            <w:tcW w:type="dxa" w:w="3120"/>
-            <w:vAlign w:val="center"/>
-          </w:tcPr>
-          <w:p>
-            <w:pPr>
-              <w:spacing w:after="0"/>
-            </w:pPr>
-            <w:r>
-              <w:rPr>
-                <w:rFonts w:ascii="Calibri" w:hAnsi="Calibri" w:eastAsia="Microsoft YaHei"/>
-                <w:b w:val="0"/>
-                <w:sz w:val="20"/>
-              </w:rPr>
-              <w:t>多 Agent 拆分</w:t>
-            </w:r>
-          </w:p>
-        </w:tc>
-        <w:tc>
-          <w:tcPr>
-            <w:tcW w:type="dxa" w:w="3120"/>
-            <w:vAlign w:val="center"/>
-          </w:tcPr>
-          <w:p>
-            <w:pPr>
-              <w:spacing w:after="0"/>
-            </w:pPr>
-            <w:r>
-              <w:rPr>
-                <w:rFonts w:ascii="Calibri" w:hAnsi="Calibri" w:eastAsia="Microsoft YaHei"/>
-                <w:b w:val="0"/>
-                <w:sz w:val="20"/>
-              </w:rPr>
-              <w:t>拆分 Designer/Planner/Critic/Repair 等职责</w:t>
-            </w:r>
-          </w:p>
-        </w:tc>
-        <w:tc>
-          <w:tcPr>
-            <w:tcW w:type="dxa" w:w="3120"/>
-            <w:vAlign w:val="center"/>
-          </w:tcPr>
-          <w:p>
-            <w:pPr>
-              <w:spacing w:after="0"/>
-            </w:pPr>
-            <w:r>
-              <w:rPr>
-                <w:rFonts w:ascii="Calibri" w:hAnsi="Calibri" w:eastAsia="Microsoft YaHei"/>
-                <w:b w:val="0"/>
-                <w:sz w:val="20"/>
-              </w:rPr>
-              <w:t>避免单 prompt 承担全部逻辑</w:t>
-            </w:r>
-          </w:p>
-        </w:tc>
-      </w:tr>
-      <w:tr>
-        <w:tc>
-          <w:tcPr>
-            <w:tcW w:type="dxa" w:w="3120"/>
-            <w:vAlign w:val="center"/>
-          </w:tcPr>
-          <w:p>
-            <w:pPr>
-              <w:spacing w:after="0"/>
-            </w:pPr>
-            <w:r>
-              <w:rPr>
-                <w:rFonts w:ascii="Calibri" w:hAnsi="Calibri" w:eastAsia="Microsoft YaHei"/>
-                <w:b w:val="0"/>
-                <w:sz w:val="20"/>
-              </w:rPr>
-              <w:t>语义规划层</w:t>
-            </w:r>
-          </w:p>
-        </w:tc>
-        <w:tc>
-          <w:tcPr>
-            <w:tcW w:type="dxa" w:w="3120"/>
-            <w:vAlign w:val="center"/>
-          </w:tcPr>
-          <w:p>
-            <w:pPr>
-              <w:spacing w:after="0"/>
-            </w:pPr>
-            <w:r>
-              <w:rPr>
-                <w:rFonts w:ascii="Calibri" w:hAnsi="Calibri" w:eastAsia="Microsoft YaHei"/>
-                <w:b w:val="0"/>
-                <w:sz w:val="20"/>
-              </w:rPr>
-              <w:t>LLM 输出 JSON 而非坐标</w:t>
-            </w:r>
-          </w:p>
-        </w:tc>
-        <w:tc>
-          <w:tcPr>
-            <w:tcW w:type="dxa" w:w="3120"/>
-            <w:vAlign w:val="center"/>
-          </w:tcPr>
-          <w:p>
-            <w:pPr>
-              <w:spacing w:after="0"/>
-            </w:pPr>
-            <w:r>
-              <w:rPr>
-                <w:rFonts w:ascii="Calibri" w:hAnsi="Calibri" w:eastAsia="Microsoft YaHei"/>
-                <w:b w:val="0"/>
-                <w:sz w:val="20"/>
-              </w:rPr>
-              <w:t>提高稳定性和可验证性</w:t>
-            </w:r>
-          </w:p>
-        </w:tc>
-      </w:tr>
-      <w:tr>
-        <w:tc>
-          <w:tcPr>
-            <w:tcW w:type="dxa" w:w="3120"/>
-            <w:vAlign w:val="center"/>
-          </w:tcPr>
-          <w:p>
-            <w:pPr>
-              <w:spacing w:after="0"/>
-            </w:pPr>
-            <w:r>
-              <w:rPr>
-                <w:rFonts w:ascii="Calibri" w:hAnsi="Calibri" w:eastAsia="Microsoft YaHei"/>
-                <w:b w:val="0"/>
-                <w:sz w:val="20"/>
-              </w:rPr>
-              <w:t>确定性几何</w:t>
-            </w:r>
-          </w:p>
-        </w:tc>
-        <w:tc>
-          <w:tcPr>
-            <w:tcW w:type="dxa" w:w="3120"/>
-            <w:vAlign w:val="center"/>
-          </w:tcPr>
-          <w:p>
-            <w:pPr>
-              <w:spacing w:after="0"/>
-            </w:pPr>
-            <w:r>
-              <w:rPr>
-                <w:rFonts w:ascii="Calibri" w:hAnsi="Calibri" w:eastAsia="Microsoft YaHei"/>
-                <w:b w:val="0"/>
-                <w:sz w:val="20"/>
-              </w:rPr>
-              <w:t>CSG、BSP、A* 本地落地</w:t>
-            </w:r>
-          </w:p>
-        </w:tc>
-        <w:tc>
-          <w:tcPr>
-            <w:tcW w:type="dxa" w:w="3120"/>
-            <w:vAlign w:val="center"/>
-          </w:tcPr>
-          <w:p>
-            <w:pPr>
-              <w:spacing w:after="0"/>
-            </w:pPr>
-            <w:r>
-              <w:rPr>
-                <w:rFonts w:ascii="Calibri" w:hAnsi="Calibri" w:eastAsia="Microsoft YaHei"/>
-                <w:b w:val="0"/>
-                <w:sz w:val="20"/>
-              </w:rPr>
-              <w:t>用程序保证结构合法</w:t>
-            </w:r>
-          </w:p>
-        </w:tc>
-      </w:tr>
-      <w:tr>
-        <w:tc>
-          <w:tcPr>
-            <w:tcW w:type="dxa" w:w="3120"/>
-            <w:vAlign w:val="center"/>
-          </w:tcPr>
-          <w:p>
-            <w:pPr>
-              <w:spacing w:after="0"/>
-            </w:pPr>
-            <w:r>
-              <w:rPr>
-                <w:rFonts w:ascii="Calibri" w:hAnsi="Calibri" w:eastAsia="Microsoft YaHei"/>
-                <w:b w:val="0"/>
-                <w:sz w:val="20"/>
-              </w:rPr>
-              <w:t>模板学习</w:t>
-            </w:r>
-          </w:p>
-        </w:tc>
-        <w:tc>
-          <w:tcPr>
-            <w:tcW w:type="dxa" w:w="3120"/>
-            <w:vAlign w:val="center"/>
-          </w:tcPr>
-          <w:p>
-            <w:pPr>
-              <w:spacing w:after="0"/>
-            </w:pPr>
-            <w:r>
-              <w:rPr>
-                <w:rFonts w:ascii="Calibri" w:hAnsi="Calibri" w:eastAsia="Microsoft YaHei"/>
-                <w:b w:val="0"/>
-                <w:sz w:val="20"/>
-              </w:rPr>
-              <w:t>案例库、设计法则、审美审计</w:t>
-            </w:r>
-          </w:p>
-        </w:tc>
-        <w:tc>
-          <w:tcPr>
-            <w:tcW w:type="dxa" w:w="3120"/>
-            <w:vAlign w:val="center"/>
-          </w:tcPr>
-          <w:p>
-            <w:pPr>
-              <w:spacing w:after="0"/>
-            </w:pPr>
-            <w:r>
-              <w:rPr>
-                <w:rFonts w:ascii="Calibri" w:hAnsi="Calibri" w:eastAsia="Microsoft YaHei"/>
-                <w:b w:val="0"/>
-                <w:sz w:val="20"/>
-              </w:rPr>
-              <w:t>让建筑更像“有风格的设计”而非空壳</w:t>
-            </w:r>
-          </w:p>
-        </w:tc>
-      </w:tr>
-    </w:tbl>
-    <w:p/>
-    <w:p>
-      <w:pPr>
-        <w:pStyle w:val="Heading1"/>
-      </w:pPr>
-      <w:r>
-        <w:t>7. 实验与运行结果</w:t>
-      </w:r>
-    </w:p>
-    <w:p>
-      <w:r>
-        <w:rPr>
-          <w:rFonts w:ascii="Calibri" w:hAnsi="Calibri" w:eastAsia="Microsoft YaHei"/>
-        </w:rPr>
-        <w:t>截至本报告生成时，项目全量测试为 176 项通过、0 项失败，其中包括 3 项课程提交文档测试；原项目功能基线为 173 项通过、0 项失败。测试覆盖 Architect fallback、Planner、CSG、BSP、A*、Decorator、模板法则、候选择优、LLM provider、材料目录、可视化输出等模块。</w:t>
-      </w:r>
-    </w:p>
-    <w:p>
-      <w:r>
-        <w:rPr>
-          <w:rFonts w:ascii="Calibri" w:hAnsi="Calibri" w:eastAsia="Microsoft YaHei"/>
-        </w:rPr>
-        <w:t>本地样例输出目录 out/2026-06-19-145532212/ 包含 blueprint.json、architect_datapack、raw_build.mcfunction、preview.html 和 run_report.md。该样例记录了 prompt“建造一个木屋别墅”、LLM 调用状态、几何统计、装饰数量、模板法则覆盖率、QA 状态和 Minecraft 使用步骤。</w:t>
-      </w:r>
-    </w:p>
-    <w:p>
-      <w:r>
-        <w:rPr>
-          <w:rFonts w:ascii="Calibri" w:hAnsi="Calibri" w:eastAsia="Microsoft YaHei"/>
-        </w:rPr>
-        <w:t>为了避免现场演示的不确定性，项目把每次生成的关键证据写入 run_report.md。报告会记录本次是否调用 LLM、seed 来源、体块列表、材料角色、房间节点、场地策略、模板审计分数、命令数量和 Minecraft 操作步骤。这样即使不打开游戏，也可以追踪一次生成是否真实发生。</w:t>
+        <w:t>7 结论</w:t>
       </w:r>
     </w:p>
     <w:p>
       <w:pPr>
-        <w:pStyle w:val="ListBullet"/>
+        <w:ind w:firstLine="440"/>
+        <w:jc w:val="both"/>
       </w:pPr>
       <w:r>
         <w:rPr>
-          <w:rFonts w:ascii="Calibri" w:hAnsi="Calibri" w:eastAsia="Microsoft YaHei"/>
+          <w:rFonts w:ascii="Times New Roman" w:hAnsi="Times New Roman" w:eastAsia="SimSun"/>
+          <w:sz w:val="22"/>
         </w:rPr>
-        <w:t>测试命令：npm test。</w:t>
+        <w:t>Minecraft Constructing Agents 构建了一条从中文建筑需求到 Minecraft 可执行数据包的完整流水线。项目的核心经验是：在开放生成任务中，大语言模型更适合作为语义和设计决策者，而不是直接坐标生成器；本地几何算法、材料目录、连通性校验和命令优化可以为其提供稳定落地能力。</w:t>
       </w:r>
     </w:p>
     <w:p>
       <w:pPr>
-        <w:pStyle w:val="ListBullet"/>
+        <w:ind w:firstLine="440"/>
+        <w:jc w:val="both"/>
       </w:pPr>
       <w:r>
         <w:rPr>
-          <w:rFonts w:ascii="Calibri" w:hAnsi="Calibri" w:eastAsia="Microsoft YaHei"/>
+          <w:rFonts w:ascii="Times New Roman" w:hAnsi="Times New Roman" w:eastAsia="SimSun"/>
+          <w:sz w:val="22"/>
         </w:rPr>
-        <w:t>mock 运行命令：npm start -- --mode mock "建一个欧式大房子"。</w:t>
-      </w:r>
-    </w:p>
-    <w:p>
-      <w:pPr>
-        <w:pStyle w:val="ListBullet"/>
-      </w:pPr>
-      <w:r>
-        <w:rPr>
-          <w:rFonts w:ascii="Calibri" w:hAnsi="Calibri" w:eastAsia="Microsoft YaHei"/>
-        </w:rPr>
-        <w:t>Minecraft 命令：/reload，然后 /function architect:run。</w:t>
-      </w:r>
-    </w:p>
-    <w:p>
-      <w:pPr>
-        <w:pStyle w:val="ListBullet"/>
-      </w:pPr>
-      <w:r>
-        <w:rPr>
-          <w:rFonts w:ascii="Calibri" w:hAnsi="Calibri" w:eastAsia="Microsoft YaHei"/>
-        </w:rPr>
-        <w:t>运行结果截图补充位：可后续加入 preview.html 截图或游戏内建筑截图。</w:t>
-      </w:r>
-    </w:p>
-    <w:tbl>
-      <w:tblPr>
-        <w:tblStyle w:val="TableGrid"/>
-        <w:tblW w:type="auto" w:w="0"/>
-        <w:jc w:val="center"/>
-        <w:tblLook w:firstColumn="1" w:firstRow="1" w:lastColumn="0" w:lastRow="0" w:noHBand="0" w:noVBand="1" w:val="04A0"/>
-      </w:tblPr>
-      <w:tblGrid>
-        <w:gridCol w:w="3120"/>
-        <w:gridCol w:w="3120"/>
-        <w:gridCol w:w="3120"/>
-      </w:tblGrid>
-      <w:tr>
-        <w:tc>
-          <w:tcPr>
-            <w:tcW w:type="dxa" w:w="3120"/>
-            <w:vAlign w:val="center"/>
-            <w:shd w:fill="F2F4F7"/>
-          </w:tcPr>
-          <w:p>
-            <w:pPr>
-              <w:spacing w:after="0"/>
-            </w:pPr>
-            <w:r>
-              <w:rPr>
-                <w:rFonts w:ascii="Calibri" w:hAnsi="Calibri" w:eastAsia="Microsoft YaHei"/>
-                <w:b/>
-                <w:sz w:val="20"/>
-              </w:rPr>
-              <w:t>样例指标</w:t>
-            </w:r>
-          </w:p>
-        </w:tc>
-        <w:tc>
-          <w:tcPr>
-            <w:tcW w:type="dxa" w:w="3120"/>
-            <w:vAlign w:val="center"/>
-            <w:shd w:fill="F2F4F7"/>
-          </w:tcPr>
-          <w:p>
-            <w:pPr>
-              <w:spacing w:after="0"/>
-            </w:pPr>
-            <w:r>
-              <w:rPr>
-                <w:rFonts w:ascii="Calibri" w:hAnsi="Calibri" w:eastAsia="Microsoft YaHei"/>
-                <w:b/>
-                <w:sz w:val="20"/>
-              </w:rPr>
-              <w:t>数值</w:t>
-            </w:r>
-          </w:p>
-        </w:tc>
-        <w:tc>
-          <w:tcPr>
-            <w:tcW w:type="dxa" w:w="3120"/>
-            <w:vAlign w:val="center"/>
-            <w:shd w:fill="F2F4F7"/>
-          </w:tcPr>
-          <w:p>
-            <w:pPr>
-              <w:spacing w:after="0"/>
-            </w:pPr>
-            <w:r>
-              <w:rPr>
-                <w:rFonts w:ascii="Calibri" w:hAnsi="Calibri" w:eastAsia="Microsoft YaHei"/>
-                <w:b/>
-                <w:sz w:val="20"/>
-              </w:rPr>
-              <w:t>说明</w:t>
-            </w:r>
-          </w:p>
-        </w:tc>
-      </w:tr>
-      <w:tr>
-        <w:tc>
-          <w:tcPr>
-            <w:tcW w:type="dxa" w:w="3120"/>
-            <w:vAlign w:val="center"/>
-          </w:tcPr>
-          <w:p>
-            <w:pPr>
-              <w:spacing w:after="0"/>
-            </w:pPr>
-            <w:r>
-              <w:rPr>
-                <w:rFonts w:ascii="Calibri" w:hAnsi="Calibri" w:eastAsia="Microsoft YaHei"/>
-                <w:b w:val="0"/>
-                <w:sz w:val="20"/>
-              </w:rPr>
-              <w:t>建筑尺寸</w:t>
-            </w:r>
-          </w:p>
-        </w:tc>
-        <w:tc>
-          <w:tcPr>
-            <w:tcW w:type="dxa" w:w="3120"/>
-            <w:vAlign w:val="center"/>
-          </w:tcPr>
-          <w:p>
-            <w:pPr>
-              <w:spacing w:after="0"/>
-            </w:pPr>
-            <w:r>
-              <w:rPr>
-                <w:rFonts w:ascii="Calibri" w:hAnsi="Calibri" w:eastAsia="Microsoft YaHei"/>
-                <w:b w:val="0"/>
-                <w:sz w:val="20"/>
-              </w:rPr>
-              <w:t>43 x 16 x 57</w:t>
-            </w:r>
-          </w:p>
-        </w:tc>
-        <w:tc>
-          <w:tcPr>
-            <w:tcW w:type="dxa" w:w="3120"/>
-            <w:vAlign w:val="center"/>
-          </w:tcPr>
-          <w:p>
-            <w:pPr>
-              <w:spacing w:after="0"/>
-            </w:pPr>
-            <w:r>
-              <w:rPr>
-                <w:rFonts w:ascii="Calibri" w:hAnsi="Calibri" w:eastAsia="Microsoft YaHei"/>
-                <w:b w:val="0"/>
-                <w:sz w:val="20"/>
-              </w:rPr>
-              <w:t>来自 out/2026-06-19-145532212/run_report.md</w:t>
-            </w:r>
-          </w:p>
-        </w:tc>
-      </w:tr>
-      <w:tr>
-        <w:tc>
-          <w:tcPr>
-            <w:tcW w:type="dxa" w:w="3120"/>
-            <w:vAlign w:val="center"/>
-          </w:tcPr>
-          <w:p>
-            <w:pPr>
-              <w:spacing w:after="0"/>
-            </w:pPr>
-            <w:r>
-              <w:rPr>
-                <w:rFonts w:ascii="Calibri" w:hAnsi="Calibri" w:eastAsia="Microsoft YaHei"/>
-                <w:b w:val="0"/>
-                <w:sz w:val="20"/>
-              </w:rPr>
-              <w:t>房间连通</w:t>
-            </w:r>
-          </w:p>
-        </w:tc>
-        <w:tc>
-          <w:tcPr>
-            <w:tcW w:type="dxa" w:w="3120"/>
-            <w:vAlign w:val="center"/>
-          </w:tcPr>
-          <w:p>
-            <w:pPr>
-              <w:spacing w:after="0"/>
-            </w:pPr>
-            <w:r>
-              <w:rPr>
-                <w:rFonts w:ascii="Calibri" w:hAnsi="Calibri" w:eastAsia="Microsoft YaHei"/>
-                <w:b w:val="0"/>
-                <w:sz w:val="20"/>
-              </w:rPr>
-              <w:t>14/14</w:t>
-            </w:r>
-          </w:p>
-        </w:tc>
-        <w:tc>
-          <w:tcPr>
-            <w:tcW w:type="dxa" w:w="3120"/>
-            <w:vAlign w:val="center"/>
-          </w:tcPr>
-          <w:p>
-            <w:pPr>
-              <w:spacing w:after="0"/>
-            </w:pPr>
-            <w:r>
-              <w:rPr>
-                <w:rFonts w:ascii="Calibri" w:hAnsi="Calibri" w:eastAsia="Microsoft YaHei"/>
-                <w:b w:val="0"/>
-                <w:sz w:val="20"/>
-              </w:rPr>
-              <w:t>入口可达房间全部通过</w:t>
-            </w:r>
-          </w:p>
-        </w:tc>
-      </w:tr>
-      <w:tr>
-        <w:tc>
-          <w:tcPr>
-            <w:tcW w:type="dxa" w:w="3120"/>
-            <w:vAlign w:val="center"/>
-          </w:tcPr>
-          <w:p>
-            <w:pPr>
-              <w:spacing w:after="0"/>
-            </w:pPr>
-            <w:r>
-              <w:rPr>
-                <w:rFonts w:ascii="Calibri" w:hAnsi="Calibri" w:eastAsia="Microsoft YaHei"/>
-                <w:b w:val="0"/>
-                <w:sz w:val="20"/>
-              </w:rPr>
-              <w:t>QA</w:t>
-            </w:r>
-          </w:p>
-        </w:tc>
-        <w:tc>
-          <w:tcPr>
-            <w:tcW w:type="dxa" w:w="3120"/>
-            <w:vAlign w:val="center"/>
-          </w:tcPr>
-          <w:p>
-            <w:pPr>
-              <w:spacing w:after="0"/>
-            </w:pPr>
-            <w:r>
-              <w:rPr>
-                <w:rFonts w:ascii="Calibri" w:hAnsi="Calibri" w:eastAsia="Microsoft YaHei"/>
-                <w:b w:val="0"/>
-                <w:sz w:val="20"/>
-              </w:rPr>
-              <w:t>9/9</w:t>
-            </w:r>
-          </w:p>
-        </w:tc>
-        <w:tc>
-          <w:tcPr>
-            <w:tcW w:type="dxa" w:w="3120"/>
-            <w:vAlign w:val="center"/>
-          </w:tcPr>
-          <w:p>
-            <w:pPr>
-              <w:spacing w:after="0"/>
-            </w:pPr>
-            <w:r>
-              <w:rPr>
-                <w:rFonts w:ascii="Calibri" w:hAnsi="Calibri" w:eastAsia="Microsoft YaHei"/>
-                <w:b w:val="0"/>
-                <w:sz w:val="20"/>
-              </w:rPr>
-              <w:t>结构、材料、入口和装饰等检查通过</w:t>
-            </w:r>
-          </w:p>
-        </w:tc>
-      </w:tr>
-      <w:tr>
-        <w:tc>
-          <w:tcPr>
-            <w:tcW w:type="dxa" w:w="3120"/>
-            <w:vAlign w:val="center"/>
-          </w:tcPr>
-          <w:p>
-            <w:pPr>
-              <w:spacing w:after="0"/>
-            </w:pPr>
-            <w:r>
-              <w:rPr>
-                <w:rFonts w:ascii="Calibri" w:hAnsi="Calibri" w:eastAsia="Microsoft YaHei"/>
-                <w:b w:val="0"/>
-                <w:sz w:val="20"/>
-              </w:rPr>
-              <w:t>命令压缩</w:t>
-            </w:r>
-          </w:p>
-        </w:tc>
-        <w:tc>
-          <w:tcPr>
-            <w:tcW w:type="dxa" w:w="3120"/>
-            <w:vAlign w:val="center"/>
-          </w:tcPr>
-          <w:p>
-            <w:pPr>
-              <w:spacing w:after="0"/>
-            </w:pPr>
-            <w:r>
-              <w:rPr>
-                <w:rFonts w:ascii="Calibri" w:hAnsi="Calibri" w:eastAsia="Microsoft YaHei"/>
-                <w:b w:val="0"/>
-                <w:sz w:val="20"/>
-              </w:rPr>
-              <w:t>2692 -&gt; 1251</w:t>
-            </w:r>
-          </w:p>
-        </w:tc>
-        <w:tc>
-          <w:tcPr>
-            <w:tcW w:type="dxa" w:w="3120"/>
-            <w:vAlign w:val="center"/>
-          </w:tcPr>
-          <w:p>
-            <w:pPr>
-              <w:spacing w:after="0"/>
-            </w:pPr>
-            <w:r>
-              <w:rPr>
-                <w:rFonts w:ascii="Calibri" w:hAnsi="Calibri" w:eastAsia="Microsoft YaHei"/>
-                <w:b w:val="0"/>
-                <w:sz w:val="20"/>
-              </w:rPr>
-              <w:t>减少函数体积，便于数据包执行</w:t>
-            </w:r>
-          </w:p>
-        </w:tc>
-      </w:tr>
-    </w:tbl>
-    <w:p/>
-    <w:p>
-      <w:pPr>
-        <w:pStyle w:val="Heading1"/>
-      </w:pPr>
-      <w:r>
-        <w:t>8. 整体性、创新性与课程要求对齐</w:t>
-      </w:r>
-    </w:p>
-    <w:p>
-      <w:r>
-        <w:rPr>
-          <w:rFonts w:ascii="Calibri" w:hAnsi="Calibri" w:eastAsia="Microsoft YaHei"/>
-        </w:rPr>
-        <w:t>课程评分强调工作量、整体性和创新性。本项目在整体性上围绕一个明确问题展开：如何把开放中文建筑需求稳定落地为 Minecraft 可执行数据包。所有 Agent、几何模块、模板语料和评测脚本都服务于这个目标，而不是把多个无关 skill 拼在一起。</w:t>
-      </w:r>
-    </w:p>
-    <w:p>
-      <w:r>
-        <w:rPr>
-          <w:rFonts w:ascii="Calibri" w:hAnsi="Calibri" w:eastAsia="Microsoft YaHei"/>
-        </w:rPr>
-        <w:t>创新性主要体现在三个方面。第一，LLM 与本地几何的边界划分比较清楚，避免了直接坐标生成的不可控。第二，模板语料被抽象为设计语法和审美法则，而不是简单复制。第三，项目保留 mock 兜底和测试闭环，使没有 token 或现场网络时仍能完整演示。</w:t>
-      </w:r>
-    </w:p>
-    <w:p>
-      <w:pPr>
-        <w:pStyle w:val="ListBullet"/>
-      </w:pPr>
-      <w:r>
-        <w:rPr>
-          <w:rFonts w:ascii="Calibri" w:hAnsi="Calibri" w:eastAsia="Microsoft YaHei"/>
-        </w:rPr>
-        <w:t>工作量：多智能体、几何引擎、模板分析、导出、测试和文档完整覆盖。</w:t>
-      </w:r>
-    </w:p>
-    <w:p>
-      <w:pPr>
-        <w:pStyle w:val="ListBullet"/>
-      </w:pPr>
-      <w:r>
-        <w:rPr>
-          <w:rFonts w:ascii="Calibri" w:hAnsi="Calibri" w:eastAsia="Microsoft YaHei"/>
-        </w:rPr>
-        <w:t>整体性：所有模块围绕自然语言到 datapack 的主流程协作。</w:t>
-      </w:r>
-    </w:p>
-    <w:p>
-      <w:pPr>
-        <w:pStyle w:val="ListBullet"/>
-      </w:pPr>
-      <w:r>
-        <w:rPr>
-          <w:rFonts w:ascii="Calibri" w:hAnsi="Calibri" w:eastAsia="Microsoft YaHei"/>
-        </w:rPr>
-        <w:t>创新性：将建筑参考案例转化为可检索、可修复、可审计的语法层。</w:t>
+        <w:t>通过多智能体分工、CSG/BSP/A* 几何引擎、模板语料学习和质量闭环，项目将一个模糊的建房需求转化为可复现、可检查、可安装的工程产物。相比最终单次生成效果，项目更重要的贡献在于展示了一个课程级智能体系统如何从想法、失败尝试和架构调整中逐步形成。</w:t>
       </w:r>
     </w:p>
     <w:p>
@@ -1709,23 +1348,20 @@
         <w:pStyle w:val="Heading1"/>
       </w:pPr>
       <w:r>
-        <w:t>9. 不足与后续方向</w:t>
+        <w:t>AI 辅助说明</w:t>
       </w:r>
     </w:p>
     <w:p>
+      <w:pPr>
+        <w:ind w:firstLine="440"/>
+        <w:jc w:val="both"/>
+      </w:pPr>
       <w:r>
         <w:rPr>
-          <w:rFonts w:ascii="Calibri" w:hAnsi="Calibri" w:eastAsia="Microsoft YaHei"/>
+          <w:rFonts w:ascii="Times New Roman" w:hAnsi="Times New Roman" w:eastAsia="SimSun"/>
+          <w:sz w:val="22"/>
         </w:rPr>
-        <w:t>当前系统已经实现从中文 prompt 到 Minecraft 数据包的闭环，但它仍不是 Mineflayer 实时机器人，也不模拟玩家在服务器中逐块放置。GDMC HTTP 客户端已经保留，但主流程仍以数据包导出为主。另一方面，自动审美评分可以发现法则覆盖问题，却不能完全替代玩家视角下的尺度、镜头、路径和 block readability 检查。</w:t>
-      </w:r>
-    </w:p>
-    <w:p>
-      <w:r>
-        <w:rPr>
-          <w:rFonts w:ascii="Calibri" w:hAnsi="Calibri" w:eastAsia="Microsoft YaHei"/>
-        </w:rPr>
-        <w:t>后续可以继续扩展三个方向：第一，加入更可靠的视觉相似性和非复制检测；第二，补充更多真实游戏截图与人工审美评分样本；第三，将 GDMC 或 Mineflayer 执行路径与现有 datapack 路径整合，让系统既能离线导出，又能在游戏内交互式部署。</w:t>
+        <w:t>本项目合理使用 AI 工具辅助开发和文档整理。AI 辅助主要用于代码修改建议、文档初稿整理、报告润色、测试清单和网页排版检查；项目方向、系统边界、架构取舍、运行调试、测试执行、结果确认和最终整合由小组完成。报告和网站不伪造运行截图；若最终版本需要图像材料，应使用 preview.html 或 Minecraft 游戏内真实运行结果截图。</w:t>
       </w:r>
     </w:p>
     <w:p>
@@ -1733,96 +1369,59 @@
         <w:pStyle w:val="Heading1"/>
       </w:pPr>
       <w:r>
-        <w:t>10. 工作分工与 AI 辅助说明</w:t>
-      </w:r>
-    </w:p>
-    <w:p>
-      <w:r>
-        <w:rPr>
-          <w:rFonts w:ascii="Calibri" w:hAnsi="Calibri" w:eastAsia="Microsoft YaHei"/>
-        </w:rPr>
-        <w:t>本项目由龙想、石宇宸组成小组完成。小组共同参与选题确定、项目边界设定、系统架构取舍、运行调试、结果确认和最终提交材料整理。代码仓库中的提交记录反映了从初始 agent 到多智能体、语义规划、模板学习和最终提交材料的连续迭代。</w:t>
-      </w:r>
-    </w:p>
-    <w:p>
-      <w:r>
-        <w:rPr>
-          <w:rFonts w:ascii="Calibri" w:hAnsi="Calibri" w:eastAsia="Microsoft YaHei"/>
-        </w:rPr>
-        <w:t>项目合理使用 AI 工具辅助开发和文档整理。AI 辅助主要用于代码修改建议、文档初稿整理、报告润色、测试清单和网页排版检查；项目方向、架构取舍、运行验证、测试执行、结果是否采纳和最终整合由小组完成。报告和网站中不会伪造运行结果，缺少截图的位置均标记为真实截图补充位。</w:t>
+        <w:t>参考资料</w:t>
       </w:r>
     </w:p>
     <w:p>
       <w:pPr>
-        <w:pStyle w:val="Heading1"/>
+        <w:ind w:left="360" w:hanging="360"/>
+        <w:jc w:val="left"/>
       </w:pPr>
       <w:r>
-        <w:t>11. 提交材料与补图说明</w:t>
-      </w:r>
-    </w:p>
-    <w:p>
-      <w:r>
         <w:rPr>
-          <w:rFonts w:ascii="Calibri" w:hAnsi="Calibri" w:eastAsia="Microsoft YaHei"/>
+          <w:rFonts w:ascii="Times New Roman" w:hAnsi="Times New Roman" w:eastAsia="SimSun"/>
+          <w:sz w:val="21"/>
         </w:rPr>
-        <w:t>最终提交建议包含三类材料：第一，GitHub 仓库链接，用于查看源码、测试和文档；第二，本报告 PDF，用于教学网书面报告提交；第三，docs/index.html 展示页和 SUBMISSION.md 提交清单，用于快速理解项目结构与复现方式。由于课程要求不得伪造运行结果，当前缺少的 Minecraft 游戏内截图以“真实截图补充位”呈现。</w:t>
-      </w:r>
-    </w:p>
-    <w:p>
-      <w:r>
-        <w:rPr>
-          <w:rFonts w:ascii="Calibri" w:hAnsi="Calibri" w:eastAsia="Microsoft YaHei"/>
-        </w:rPr>
-        <w:t>如果后续需要补充截图，可以先运行 npm start -- --mode mock "建一个欧式大房子"，打开输出目录中的 preview.html 截图；也可以将 architect_datapack 复制到 Minecraft 世界 datapacks 目录，进入游戏执行 /reload 与 /function architect:run 后截图。建议补充 2 到 3 张图：preview.html 总览、游戏内外观、游戏内室内或入口路径。</w:t>
+        <w:t>[1] Minecraft-Constructing-Agents 项目仓库与 README，https://github.com/CityC196/Minecraft-Constructing-Agents。</w:t>
       </w:r>
     </w:p>
     <w:p>
       <w:pPr>
-        <w:pStyle w:val="ListBullet"/>
+        <w:ind w:left="360" w:hanging="360"/>
+        <w:jc w:val="left"/>
       </w:pPr>
       <w:r>
         <w:rPr>
-          <w:rFonts w:ascii="Calibri" w:hAnsi="Calibri" w:eastAsia="Microsoft YaHei"/>
+          <w:rFonts w:ascii="Times New Roman" w:hAnsi="Times New Roman" w:eastAsia="SimSun"/>
+          <w:sz w:val="21"/>
         </w:rPr>
-        <w:t>不要把 .env、API key、out/ 大型生成目录或课程 PDF 提交到源码仓库。</w:t>
+        <w:t>[2] 本地样例运行报告：out/2026-06-19-145532212/run_report.md。</w:t>
       </w:r>
     </w:p>
     <w:p>
       <w:pPr>
-        <w:pStyle w:val="ListBullet"/>
+        <w:ind w:left="360" w:hanging="360"/>
+        <w:jc w:val="left"/>
       </w:pPr>
       <w:r>
         <w:rPr>
-          <w:rFonts w:ascii="Calibri" w:hAnsi="Calibri" w:eastAsia="Microsoft YaHei"/>
+          <w:rFonts w:ascii="Times New Roman" w:hAnsi="Times New Roman" w:eastAsia="SimSun"/>
+          <w:sz w:val="21"/>
         </w:rPr>
-        <w:t>报告 PDF 可以作为教学网附件提交；源码仓库保持可运行和可复现。</w:t>
+        <w:t>[3] 模板吸收与设计法则相关文档：docs/template-assimilation-plan.md。</w:t>
       </w:r>
     </w:p>
     <w:p>
       <w:pPr>
-        <w:pStyle w:val="ListBullet"/>
+        <w:ind w:left="360" w:hanging="360"/>
+        <w:jc w:val="left"/>
       </w:pPr>
       <w:r>
         <w:rPr>
-          <w:rFonts w:ascii="Calibri" w:hAnsi="Calibri" w:eastAsia="Microsoft YaHei"/>
+          <w:rFonts w:ascii="Times New Roman" w:hAnsi="Times New Roman" w:eastAsia="SimSun"/>
+          <w:sz w:val="21"/>
         </w:rPr>
-        <w:t>补图时只使用真实运行结果，不使用生成式图片冒充 Minecraft 输出。</w:t>
-      </w:r>
-    </w:p>
-    <w:p>
-      <w:pPr>
-        <w:pStyle w:val="Heading1"/>
-      </w:pPr>
-      <w:r>
-        <w:t>12. 结论</w:t>
-      </w:r>
-    </w:p>
-    <w:p>
-      <w:r>
-        <w:rPr>
-          <w:rFonts w:ascii="Calibri" w:hAnsi="Calibri" w:eastAsia="Microsoft YaHei"/>
-        </w:rPr>
-        <w:t>Minecraft Constructing Agents 通过多智能体语义规划和本地确定性几何引擎，把一个开放的中文建筑需求转化为可复现、可校验、可安装的数据包输出。项目的价值不在于某一次生成结果一定完美，而在于它把大模型智能体的创造性、本地算法的可靠性、模板语料的风格经验和工程测试闭环整合到同一条流水线中；从课程项目角度看，最重要的探索是从直接生成坐标，逐步改为多 Agent 分工、语义 JSON、确定性几何和模板质量闭环。</w:t>
+        <w:t>[4] 课程提交展示页与提交清单：docs/index.html，SUBMISSION.md。</w:t>
       </w:r>
     </w:p>
     <w:sectPr>
@@ -1841,15 +1440,16 @@
   <w:p>
     <w:pPr>
       <w:pStyle w:val="Footer"/>
+      <w:ind w:firstLine="0"/>
       <w:jc w:val="center"/>
     </w:pPr>
     <w:r>
       <w:rPr>
-        <w:rFonts w:ascii="Calibri" w:hAnsi="Calibri" w:eastAsia="Microsoft YaHei"/>
+        <w:rFonts w:ascii="Times New Roman" w:hAnsi="Times New Roman" w:eastAsia="SimSun"/>
         <w:color w:val="666666"/>
         <w:sz w:val="18"/>
       </w:rPr>
-      <w:t>Minecraft Constructing Agents 课程项目报告</w:t>
+      <w:t>Minecraft Constructing Agents 课程项目论文</w:t>
     </w:r>
   </w:p>
 </w:ftr>
@@ -2219,10 +1819,12 @@
     <w:qFormat/>
     <w:rsid w:val="00FC693F"/>
     <w:pPr>
-      <w:spacing w:after="120" w:line="264" w:lineRule="auto"/>
+      <w:spacing w:after="160" w:line="320" w:lineRule="auto"/>
+      <w:ind w:firstLine="440"/>
+      <w:jc w:val="both"/>
     </w:pPr>
     <w:rPr>
-      <w:rFonts w:ascii="Calibri" w:hAnsi="Calibri" w:eastAsia="Microsoft YaHei"/>
+      <w:rFonts w:ascii="Times New Roman" w:hAnsi="Times New Roman" w:eastAsia="SimSun"/>
       <w:sz w:val="22"/>
     </w:rPr>
   </w:style>
@@ -2281,15 +1883,16 @@
     <w:pPr>
       <w:keepNext/>
       <w:keepLines/>
-      <w:spacing w:before="320" w:after="160"/>
+      <w:spacing w:before="320" w:after="160" w:line="300" w:lineRule="auto"/>
+      <w:ind w:firstLine="0"/>
       <w:outlineLvl w:val="0"/>
     </w:pPr>
     <w:rPr>
-      <w:rFonts w:asciiTheme="majorHAnsi" w:eastAsiaTheme="majorEastAsia" w:hAnsiTheme="majorHAnsi" w:cstheme="majorBidi" w:ascii="Calibri" w:hAnsi="Calibri" w:eastAsia="Microsoft YaHei"/>
+      <w:rFonts w:asciiTheme="majorHAnsi" w:eastAsiaTheme="majorEastAsia" w:hAnsiTheme="majorHAnsi" w:cstheme="majorBidi" w:ascii="Times New Roman" w:hAnsi="Times New Roman" w:eastAsia="SimHei"/>
       <w:b/>
       <w:bCs/>
-      <w:color w:val="2E74B5"/>
-      <w:sz w:val="32"/>
+      <w:color w:val="000000"/>
+      <w:sz w:val="28"/>
       <w:szCs w:val="28"/>
     </w:rPr>
   </w:style>
@@ -2305,15 +1908,16 @@
     <w:pPr>
       <w:keepNext/>
       <w:keepLines/>
-      <w:spacing w:before="240" w:after="120"/>
+      <w:spacing w:before="200" w:after="100" w:line="300" w:lineRule="auto"/>
+      <w:ind w:firstLine="0"/>
       <w:outlineLvl w:val="1"/>
     </w:pPr>
     <w:rPr>
-      <w:rFonts w:asciiTheme="majorHAnsi" w:eastAsiaTheme="majorEastAsia" w:hAnsiTheme="majorHAnsi" w:cstheme="majorBidi" w:ascii="Calibri" w:hAnsi="Calibri" w:eastAsia="Microsoft YaHei"/>
+      <w:rFonts w:asciiTheme="majorHAnsi" w:eastAsiaTheme="majorEastAsia" w:hAnsiTheme="majorHAnsi" w:cstheme="majorBidi" w:ascii="Times New Roman" w:hAnsi="Times New Roman" w:eastAsia="SimHei"/>
       <w:b/>
       <w:bCs/>
-      <w:color w:val="2E74B5"/>
-      <w:sz w:val="26"/>
+      <w:color w:val="000000"/>
+      <w:sz w:val="24"/>
       <w:szCs w:val="26"/>
     </w:rPr>
   </w:style>
@@ -2329,15 +1933,16 @@
     <w:pPr>
       <w:keepNext/>
       <w:keepLines/>
-      <w:spacing w:before="160" w:after="80"/>
+      <w:spacing w:before="160" w:after="80" w:line="300" w:lineRule="auto"/>
+      <w:ind w:firstLine="0"/>
       <w:outlineLvl w:val="2"/>
     </w:pPr>
     <w:rPr>
-      <w:rFonts w:asciiTheme="majorHAnsi" w:eastAsiaTheme="majorEastAsia" w:hAnsiTheme="majorHAnsi" w:cstheme="majorBidi" w:ascii="Calibri" w:hAnsi="Calibri" w:eastAsia="Microsoft YaHei"/>
+      <w:rFonts w:asciiTheme="majorHAnsi" w:eastAsiaTheme="majorEastAsia" w:hAnsiTheme="majorHAnsi" w:cstheme="majorBidi" w:ascii="Times New Roman" w:hAnsi="Times New Roman" w:eastAsia="SimHei"/>
       <w:b/>
       <w:bCs/>
-      <w:color w:val="1F4D78"/>
-      <w:sz w:val="24"/>
+      <w:color w:val="000000"/>
+      <w:sz w:val="22"/>
     </w:rPr>
   </w:style>
   <w:style w:type="paragraph" w:styleId="Heading4">

</xml_diff>

<commit_message>
Add report architecture flow diagrams
</commit_message>
<xml_diff>
--- a/course_submission/Minecraft_Constructing_Agents_课程报告.docx
+++ b/course_submission/Minecraft_Constructing_Agents_课程报告.docx
@@ -168,7 +168,7 @@
           <w:rFonts w:ascii="Times New Roman" w:hAnsi="Times New Roman" w:eastAsia="SimSun"/>
           <w:sz w:val="22"/>
         </w:rPr>
-        <w:t>系统采用“LLM 语义智能体与本地确定性几何引擎”相结合的混合架构。ArchitectAgent、PlannerAgent、CreativeDesignAgent 等模块只输出高层 JSON，描述风格、材料、体块、房间拓扑、立面节奏和场地语义。CSGBuilder、BSPPartitioner、AStarPathfinder 等本地模块再把语义描述转换为合法方块网格。Decorator、QA、Repair 和 Optimizer 模块负责室内落块、约束修复、质量检查与命令压缩。</w:t>
+        <w:t>系统采用“LLM 语义智能体与本地确定性几何引擎”相结合的混合架构，如图 1 所示。大模型主要负责开放需求理解、风格构思和高层 JSON 决策；本地程序负责坐标、材料、连通性、命令体积和数据包导出等确定性任务。</w:t>
       </w:r>
     </w:p>
     <w:p>
@@ -181,7 +181,63 @@
           <w:rFonts w:ascii="Times New Roman" w:hAnsi="Times New Roman" w:eastAsia="SimSun"/>
           <w:sz w:val="22"/>
         </w:rPr>
-        <w:t>这种边界划分保留了大语言模型在开放需求理解和风格构思上的优势，也避免让模型直接承担坐标计算、Minecraft 材料校验和命令体积控制等确定性任务。系统还保留 mock 模式，当外部模型不可用时仍可生成完整输出，便于课程评阅和复现实验。</w:t>
+        <w:t>这种边界划分是项目最重要的构思修改：我们没有让模型直接写坐标，而是让它提出建筑意图，再由程序把意图变成可检查的 Minecraft 方块网格。</w:t>
+      </w:r>
+    </w:p>
+    <w:p>
+      <w:pPr>
+        <w:spacing w:after="40"/>
+        <w:ind w:firstLine="0"/>
+        <w:jc w:val="center"/>
+      </w:pPr>
+      <w:r>
+        <w:drawing>
+          <wp:inline xmlns:a="http://schemas.openxmlformats.org/drawingml/2006/main" xmlns:pic="http://schemas.openxmlformats.org/drawingml/2006/picture">
+            <wp:extent cx="5760720" cy="2752344"/>
+            <wp:docPr id="1" name="Picture 1"/>
+            <wp:cNvGraphicFramePr>
+              <a:graphicFrameLocks noChangeAspect="1"/>
+            </wp:cNvGraphicFramePr>
+            <a:graphic>
+              <a:graphicData uri="http://schemas.openxmlformats.org/drawingml/2006/picture">
+                <pic:pic>
+                  <pic:nvPicPr>
+                    <pic:cNvPr id="0" name="overall_architecture.png"/>
+                    <pic:cNvPicPr/>
+                  </pic:nvPicPr>
+                  <pic:blipFill>
+                    <a:blip r:embed="rId10"/>
+                    <a:stretch>
+                      <a:fillRect/>
+                    </a:stretch>
+                  </pic:blipFill>
+                  <pic:spPr>
+                    <a:xfrm>
+                      <a:off x="0" y="0"/>
+                      <a:ext cx="5760720" cy="2752344"/>
+                    </a:xfrm>
+                    <a:prstGeom prst="rect"/>
+                  </pic:spPr>
+                </pic:pic>
+              </a:graphicData>
+            </a:graphic>
+          </wp:inline>
+        </w:drawing>
+      </w:r>
+    </w:p>
+    <w:p>
+      <w:pPr>
+        <w:spacing w:before="0" w:after="160"/>
+        <w:ind w:firstLine="0"/>
+        <w:jc w:val="center"/>
+      </w:pPr>
+      <w:r>
+        <w:rPr>
+          <w:rFonts w:ascii="Times New Roman" w:hAnsi="Times New Roman" w:eastAsia="SimSun"/>
+          <w:b/>
+          <w:sz w:val="21"/>
+        </w:rPr>
+        <w:t>图 1 系统总体架构：LLM 负责语义决策，本地程序负责几何落地与导出</w:t>
       </w:r>
     </w:p>
     <w:p>
@@ -618,6 +674,75 @@
     </w:p>
     <w:p>
       <w:pPr>
+        <w:ind w:firstLine="440"/>
+        <w:jc w:val="both"/>
+      </w:pPr>
+      <w:r>
+        <w:rPr>
+          <w:rFonts w:ascii="Times New Roman" w:hAnsi="Times New Roman" w:eastAsia="SimSun"/>
+          <w:sz w:val="22"/>
+        </w:rPr>
+        <w:t>图 2 展示了主流程。流程分为语义决策、确定性几何、质量闭环和数据包导出四段；每段都有明确输入输出，因此可以单独测试和回退。</w:t>
+      </w:r>
+    </w:p>
+    <w:p>
+      <w:pPr>
+        <w:spacing w:after="40"/>
+        <w:ind w:firstLine="0"/>
+        <w:jc w:val="center"/>
+      </w:pPr>
+      <w:r>
+        <w:drawing>
+          <wp:inline xmlns:a="http://schemas.openxmlformats.org/drawingml/2006/main" xmlns:pic="http://schemas.openxmlformats.org/drawingml/2006/picture">
+            <wp:extent cx="5760720" cy="3136392"/>
+            <wp:docPr id="2" name="Picture 2"/>
+            <wp:cNvGraphicFramePr>
+              <a:graphicFrameLocks noChangeAspect="1"/>
+            </wp:cNvGraphicFramePr>
+            <a:graphic>
+              <a:graphicData uri="http://schemas.openxmlformats.org/drawingml/2006/picture">
+                <pic:pic>
+                  <pic:nvPicPr>
+                    <pic:cNvPr id="0" name="generation_pipeline.png"/>
+                    <pic:cNvPicPr/>
+                  </pic:nvPicPr>
+                  <pic:blipFill>
+                    <a:blip r:embed="rId11"/>
+                    <a:stretch>
+                      <a:fillRect/>
+                    </a:stretch>
+                  </pic:blipFill>
+                  <pic:spPr>
+                    <a:xfrm>
+                      <a:off x="0" y="0"/>
+                      <a:ext cx="5760720" cy="3136392"/>
+                    </a:xfrm>
+                    <a:prstGeom prst="rect"/>
+                  </pic:spPr>
+                </pic:pic>
+              </a:graphicData>
+            </a:graphic>
+          </wp:inline>
+        </w:drawing>
+      </w:r>
+    </w:p>
+    <w:p>
+      <w:pPr>
+        <w:spacing w:before="0" w:after="160"/>
+        <w:ind w:firstLine="0"/>
+        <w:jc w:val="center"/>
+      </w:pPr>
+      <w:r>
+        <w:rPr>
+          <w:rFonts w:ascii="Times New Roman" w:hAnsi="Times New Roman" w:eastAsia="SimSun"/>
+          <w:b/>
+          <w:sz w:val="21"/>
+        </w:rPr>
+        <w:t>图 2 从中文 prompt 到 Minecraft datapack 的主流程</w:t>
+      </w:r>
+    </w:p>
+    <w:p>
+      <w:pPr>
         <w:pStyle w:val="Heading2"/>
       </w:pPr>
       <w:r>
@@ -702,7 +827,7 @@
           <w:rFonts w:ascii="Times New Roman" w:hAnsi="Times New Roman" w:eastAsia="SimSun"/>
           <w:sz w:val="22"/>
         </w:rPr>
-        <w:t>项目后期加入 mc_templates 下的 64 个本地 schematic 模板。我们没有把模板用作方块级复制库，而是将其分析为可迁移的设计语法，包括场地入口、前景花园、体块轮廓、屋顶语言、立面深度和室内场景。生成时，TemplateKnowledgeAgent 检索相关案例，CreativeDesignAgent 和 Site、Roof、Facade、Interior 模块再使用这些语法。</w:t>
+        <w:t>项目后期加入 mc_templates 下的 64 个本地 schematic 模板。我们没有把模板用作方块级复制库，而是将其分析为可迁移的设计语法，包括场地入口、前景花园、体块轮廓、屋顶语言、立面深度和室内场景。</w:t>
       </w:r>
     </w:p>
     <w:p>
@@ -715,7 +840,63 @@
           <w:rFonts w:ascii="Times New Roman" w:hAnsi="Times New Roman" w:eastAsia="SimSun"/>
           <w:sz w:val="22"/>
         </w:rPr>
-        <w:t>为降低抄袭风险，系统记录 source_fusion_policy，要求多来源融合并控制单一来源占比。模板法则覆盖、审美审计和自动修复机制构成了后期质量闭环，使建筑不只满足“能生成”，还尝试拥有可解释的风格来源和设计一致性。</w:t>
+        <w:t>如图 3 所示，模板知识会进入检索、生成、审计和修复闭环。系统记录 source_fusion_policy，要求多来源融合并控制单一来源占比，降低直接复制风险。</w:t>
+      </w:r>
+    </w:p>
+    <w:p>
+      <w:pPr>
+        <w:spacing w:after="40"/>
+        <w:ind w:firstLine="0"/>
+        <w:jc w:val="center"/>
+      </w:pPr>
+      <w:r>
+        <w:drawing>
+          <wp:inline xmlns:a="http://schemas.openxmlformats.org/drawingml/2006/main" xmlns:pic="http://schemas.openxmlformats.org/drawingml/2006/picture">
+            <wp:extent cx="5760720" cy="2752344"/>
+            <wp:docPr id="3" name="Picture 3"/>
+            <wp:cNvGraphicFramePr>
+              <a:graphicFrameLocks noChangeAspect="1"/>
+            </wp:cNvGraphicFramePr>
+            <a:graphic>
+              <a:graphicData uri="http://schemas.openxmlformats.org/drawingml/2006/picture">
+                <pic:pic>
+                  <pic:nvPicPr>
+                    <pic:cNvPr id="0" name="template_quality_loop.png"/>
+                    <pic:cNvPicPr/>
+                  </pic:nvPicPr>
+                  <pic:blipFill>
+                    <a:blip r:embed="rId12"/>
+                    <a:stretch>
+                      <a:fillRect/>
+                    </a:stretch>
+                  </pic:blipFill>
+                  <pic:spPr>
+                    <a:xfrm>
+                      <a:off x="0" y="0"/>
+                      <a:ext cx="5760720" cy="2752344"/>
+                    </a:xfrm>
+                    <a:prstGeom prst="rect"/>
+                  </pic:spPr>
+                </pic:pic>
+              </a:graphicData>
+            </a:graphic>
+          </wp:inline>
+        </w:drawing>
+      </w:r>
+    </w:p>
+    <w:p>
+      <w:pPr>
+        <w:spacing w:before="0" w:after="160"/>
+        <w:ind w:firstLine="0"/>
+        <w:jc w:val="center"/>
+      </w:pPr>
+      <w:r>
+        <w:rPr>
+          <w:rFonts w:ascii="Times New Roman" w:hAnsi="Times New Roman" w:eastAsia="SimSun"/>
+          <w:b/>
+          <w:sz w:val="21"/>
+        </w:rPr>
+        <w:t>图 3 模板语料学习与质量闭环</w:t>
       </w:r>
     </w:p>
     <w:p>
@@ -736,7 +917,7 @@
           <w:rFonts w:ascii="Times New Roman" w:hAnsi="Times New Roman" w:eastAsia="SimSun"/>
           <w:sz w:val="22"/>
         </w:rPr>
-        <w:t>项目的主要工作并不是一次性写出最终架构，而是在多轮实现中逐步修改问题定义。2026 年 5 月 28 日的初始版本建立了 Minecraft architect agent，并加入自动安装世界与建造模式；6 月 2 日，蓝图生成被拆分为多个子智能体；6 月 9 日，项目加入语义规划层和多智能体建筑技能；6 月 17 日前后，construction_method_v1 基本成型；6 月 18 日至 19 日，模板语料、schematic 分析、设计法则、审美审计、自动修复和候选择优陆续接入主流程。</w:t>
+        <w:t>项目的主要工作并不是一次性写出最终架构，而是在多轮实现中逐步修改问题定义。图 4 概括了 Git 历史中几个关键阶段：从初始 agent，到多智能体拆分、语义规划、本地几何、模板语料和质量闭环。</w:t>
       </w:r>
     </w:p>
     <w:p>
@@ -749,7 +930,63 @@
           <w:rFonts w:ascii="Times New Roman" w:hAnsi="Times New Roman" w:eastAsia="SimSun"/>
           <w:sz w:val="22"/>
         </w:rPr>
-        <w:t>这些变化反映了项目构思的转向。最初我们关注“如何生成一个房子”，后来逐步意识到课程项目更需要展示智能体系统如何分工、如何约束大模型、如何把开放语义落地为可靠工程产物。因此，系统从 prompt 驱动的单点生成，转向多 Agent 分工、语义 JSON、本地几何、模板知识和质量闭环。</w:t>
+        <w:t>这些变化反映了项目构思的转向。最初我们关注“如何生成一个房子”，后来逐步意识到课程项目更需要展示智能体系统如何分工、如何约束大模型、如何把开放语义落地为可靠工程产物。</w:t>
+      </w:r>
+    </w:p>
+    <w:p>
+      <w:pPr>
+        <w:spacing w:after="40"/>
+        <w:ind w:firstLine="0"/>
+        <w:jc w:val="center"/>
+      </w:pPr>
+      <w:r>
+        <w:drawing>
+          <wp:inline xmlns:a="http://schemas.openxmlformats.org/drawingml/2006/main" xmlns:pic="http://schemas.openxmlformats.org/drawingml/2006/picture">
+            <wp:extent cx="5760720" cy="2432304"/>
+            <wp:docPr id="4" name="Picture 4"/>
+            <wp:cNvGraphicFramePr>
+              <a:graphicFrameLocks noChangeAspect="1"/>
+            </wp:cNvGraphicFramePr>
+            <a:graphic>
+              <a:graphicData uri="http://schemas.openxmlformats.org/drawingml/2006/picture">
+                <pic:pic>
+                  <pic:nvPicPr>
+                    <pic:cNvPr id="0" name="iteration_timeline.png"/>
+                    <pic:cNvPicPr/>
+                  </pic:nvPicPr>
+                  <pic:blipFill>
+                    <a:blip r:embed="rId13"/>
+                    <a:stretch>
+                      <a:fillRect/>
+                    </a:stretch>
+                  </pic:blipFill>
+                  <pic:spPr>
+                    <a:xfrm>
+                      <a:off x="0" y="0"/>
+                      <a:ext cx="5760720" cy="2432304"/>
+                    </a:xfrm>
+                    <a:prstGeom prst="rect"/>
+                  </pic:spPr>
+                </pic:pic>
+              </a:graphicData>
+            </a:graphic>
+          </wp:inline>
+        </w:drawing>
+      </w:r>
+    </w:p>
+    <w:p>
+      <w:pPr>
+        <w:spacing w:before="0" w:after="160"/>
+        <w:ind w:firstLine="0"/>
+        <w:jc w:val="center"/>
+      </w:pPr>
+      <w:r>
+        <w:rPr>
+          <w:rFonts w:ascii="Times New Roman" w:hAnsi="Times New Roman" w:eastAsia="SimSun"/>
+          <w:b/>
+          <w:sz w:val="21"/>
+        </w:rPr>
+        <w:t>图 4 项目构思与实现迭代路线</w:t>
       </w:r>
     </w:p>
     <w:p>

</xml_diff>

<commit_message>
Polish report layout and README prompts
</commit_message>
<xml_diff>
--- a/course_submission/Minecraft_Constructing_Agents_课程报告.docx
+++ b/course_submission/Minecraft_Constructing_Agents_课程报告.docx
@@ -193,7 +193,7 @@
       <w:r>
         <w:drawing>
           <wp:inline xmlns:a="http://schemas.openxmlformats.org/drawingml/2006/main" xmlns:pic="http://schemas.openxmlformats.org/drawingml/2006/picture">
-            <wp:extent cx="5760720" cy="2752344"/>
+            <wp:extent cx="5623560" cy="2686812"/>
             <wp:docPr id="1" name="Picture 1"/>
             <wp:cNvGraphicFramePr>
               <a:graphicFrameLocks noChangeAspect="1"/>
@@ -214,7 +214,7 @@
                   <pic:spPr>
                     <a:xfrm>
                       <a:off x="0" y="0"/>
-                      <a:ext cx="5760720" cy="2752344"/>
+                      <a:ext cx="5623560" cy="2686812"/>
                     </a:xfrm>
                     <a:prstGeom prst="rect"/>
                   </pic:spPr>
@@ -687,62 +687,6 @@
     </w:p>
     <w:p>
       <w:pPr>
-        <w:spacing w:after="40"/>
-        <w:ind w:firstLine="0"/>
-        <w:jc w:val="center"/>
-      </w:pPr>
-      <w:r>
-        <w:drawing>
-          <wp:inline xmlns:a="http://schemas.openxmlformats.org/drawingml/2006/main" xmlns:pic="http://schemas.openxmlformats.org/drawingml/2006/picture">
-            <wp:extent cx="5760720" cy="3136392"/>
-            <wp:docPr id="2" name="Picture 2"/>
-            <wp:cNvGraphicFramePr>
-              <a:graphicFrameLocks noChangeAspect="1"/>
-            </wp:cNvGraphicFramePr>
-            <a:graphic>
-              <a:graphicData uri="http://schemas.openxmlformats.org/drawingml/2006/picture">
-                <pic:pic>
-                  <pic:nvPicPr>
-                    <pic:cNvPr id="0" name="generation_pipeline.png"/>
-                    <pic:cNvPicPr/>
-                  </pic:nvPicPr>
-                  <pic:blipFill>
-                    <a:blip r:embed="rId11"/>
-                    <a:stretch>
-                      <a:fillRect/>
-                    </a:stretch>
-                  </pic:blipFill>
-                  <pic:spPr>
-                    <a:xfrm>
-                      <a:off x="0" y="0"/>
-                      <a:ext cx="5760720" cy="3136392"/>
-                    </a:xfrm>
-                    <a:prstGeom prst="rect"/>
-                  </pic:spPr>
-                </pic:pic>
-              </a:graphicData>
-            </a:graphic>
-          </wp:inline>
-        </w:drawing>
-      </w:r>
-    </w:p>
-    <w:p>
-      <w:pPr>
-        <w:spacing w:before="0" w:after="160"/>
-        <w:ind w:firstLine="0"/>
-        <w:jc w:val="center"/>
-      </w:pPr>
-      <w:r>
-        <w:rPr>
-          <w:rFonts w:ascii="Times New Roman" w:hAnsi="Times New Roman" w:eastAsia="SimSun"/>
-          <w:b/>
-          <w:sz w:val="21"/>
-        </w:rPr>
-        <w:t>图 2 从中文 prompt 到 Minecraft datapack 的主流程</w:t>
-      </w:r>
-    </w:p>
-    <w:p>
-      <w:pPr>
         <w:pStyle w:val="Heading2"/>
       </w:pPr>
       <w:r>
@@ -811,6 +755,62 @@
     </w:p>
     <w:p>
       <w:pPr>
+        <w:spacing w:after="40"/>
+        <w:ind w:firstLine="0"/>
+        <w:jc w:val="center"/>
+      </w:pPr>
+      <w:r>
+        <w:drawing>
+          <wp:inline xmlns:a="http://schemas.openxmlformats.org/drawingml/2006/main" xmlns:pic="http://schemas.openxmlformats.org/drawingml/2006/picture">
+            <wp:extent cx="5349240" cy="2436876"/>
+            <wp:docPr id="2" name="Picture 2"/>
+            <wp:cNvGraphicFramePr>
+              <a:graphicFrameLocks noChangeAspect="1"/>
+            </wp:cNvGraphicFramePr>
+            <a:graphic>
+              <a:graphicData uri="http://schemas.openxmlformats.org/drawingml/2006/picture">
+                <pic:pic>
+                  <pic:nvPicPr>
+                    <pic:cNvPr id="0" name="generation_pipeline.png"/>
+                    <pic:cNvPicPr/>
+                  </pic:nvPicPr>
+                  <pic:blipFill>
+                    <a:blip r:embed="rId11"/>
+                    <a:stretch>
+                      <a:fillRect/>
+                    </a:stretch>
+                  </pic:blipFill>
+                  <pic:spPr>
+                    <a:xfrm>
+                      <a:off x="0" y="0"/>
+                      <a:ext cx="5349240" cy="2436876"/>
+                    </a:xfrm>
+                    <a:prstGeom prst="rect"/>
+                  </pic:spPr>
+                </pic:pic>
+              </a:graphicData>
+            </a:graphic>
+          </wp:inline>
+        </w:drawing>
+      </w:r>
+    </w:p>
+    <w:p>
+      <w:pPr>
+        <w:spacing w:before="0" w:after="160"/>
+        <w:ind w:firstLine="0"/>
+        <w:jc w:val="center"/>
+      </w:pPr>
+      <w:r>
+        <w:rPr>
+          <w:rFonts w:ascii="Times New Roman" w:hAnsi="Times New Roman" w:eastAsia="SimSun"/>
+          <w:b/>
+          <w:sz w:val="21"/>
+        </w:rPr>
+        <w:t>图 2 从中文 prompt 到 Minecraft datapack 的主流程</w:t>
+      </w:r>
+    </w:p>
+    <w:p>
+      <w:pPr>
         <w:pStyle w:val="Heading2"/>
       </w:pPr>
       <w:r>
@@ -852,7 +852,7 @@
       <w:r>
         <w:drawing>
           <wp:inline xmlns:a="http://schemas.openxmlformats.org/drawingml/2006/main" xmlns:pic="http://schemas.openxmlformats.org/drawingml/2006/picture">
-            <wp:extent cx="5760720" cy="2752344"/>
+            <wp:extent cx="5623560" cy="2686812"/>
             <wp:docPr id="3" name="Picture 3"/>
             <wp:cNvGraphicFramePr>
               <a:graphicFrameLocks noChangeAspect="1"/>
@@ -873,7 +873,7 @@
                   <pic:spPr>
                     <a:xfrm>
                       <a:off x="0" y="0"/>
-                      <a:ext cx="5760720" cy="2752344"/>
+                      <a:ext cx="5623560" cy="2686812"/>
                     </a:xfrm>
                     <a:prstGeom prst="rect"/>
                   </pic:spPr>
@@ -942,7 +942,7 @@
       <w:r>
         <w:drawing>
           <wp:inline xmlns:a="http://schemas.openxmlformats.org/drawingml/2006/main" xmlns:pic="http://schemas.openxmlformats.org/drawingml/2006/picture">
-            <wp:extent cx="5760720" cy="2432304"/>
+            <wp:extent cx="5440680" cy="2297176"/>
             <wp:docPr id="4" name="Picture 4"/>
             <wp:cNvGraphicFramePr>
               <a:graphicFrameLocks noChangeAspect="1"/>
@@ -963,7 +963,7 @@
                   <pic:spPr>
                     <a:xfrm>
                       <a:off x="0" y="0"/>
-                      <a:ext cx="5760720" cy="2432304"/>
+                      <a:ext cx="5440680" cy="2297176"/>
                     </a:xfrm>
                     <a:prstGeom prst="rect"/>
                   </pic:spPr>
@@ -1021,6 +1021,19 @@
           <w:sz w:val="22"/>
         </w:rPr>
         <w:t>本地样例 out/2026-06-19-145532212 使用 prompt“建造一个木屋别墅”。run_report.md 记录了 LLM 调用状态、seed、几何统计、装饰数量、模板法则覆盖、QA 状态和 Minecraft 使用步骤。该样例说明系统并非只生成文本，而是在输出前经过结构、材料、连通和命令层面的检查。</w:t>
+      </w:r>
+    </w:p>
+    <w:p>
+      <w:pPr>
+        <w:ind w:firstLine="440"/>
+        <w:jc w:val="both"/>
+      </w:pPr>
+      <w:r>
+        <w:rPr>
+          <w:rFonts w:ascii="Times New Roman" w:hAnsi="Times New Roman" w:eastAsia="SimSun"/>
+          <w:sz w:val="22"/>
+        </w:rPr>
+        <w:t>为便于后续补充真实截图，仓库另整理了 docs/recommended-prompts.md，其中包含带固定 prompt-id 的推荐样例和截图取景建议。</w:t>
       </w:r>
     </w:p>
     <w:p>
@@ -1661,6 +1674,19 @@
         <w:t>[4] 课程提交展示页与提交清单：docs/index.html，SUBMISSION.md。</w:t>
       </w:r>
     </w:p>
+    <w:p>
+      <w:pPr>
+        <w:ind w:left="360" w:hanging="360"/>
+        <w:jc w:val="left"/>
+      </w:pPr>
+      <w:r>
+        <w:rPr>
+          <w:rFonts w:ascii="Times New Roman" w:hAnsi="Times New Roman" w:eastAsia="SimSun"/>
+          <w:sz w:val="21"/>
+        </w:rPr>
+        <w:t>[5] 推荐 Prompt 库与截图建议：docs/recommended-prompts.md。</w:t>
+      </w:r>
+    </w:p>
     <w:sectPr>
       <w:footerReference w:type="default" r:id="rId9"/>
       <w:pgSz w:w="12240" w:h="15840"/>

</xml_diff>

<commit_message>
Simplify README and default to mock mode
</commit_message>
<xml_diff>
--- a/course_submission/Minecraft_Constructing_Agents_课程报告.docx
+++ b/course_submission/Minecraft_Constructing_Agents_课程报告.docx
@@ -87,7 +87,7 @@
           <w:rFonts w:ascii="Times New Roman" w:hAnsi="Times New Roman" w:eastAsia="SimSun"/>
           <w:sz w:val="22"/>
         </w:rPr>
-        <w:t>Minecraft 建筑生成任务同时涉及自然语言理解、空间规划、材料选择、几何约束、连通性校验和游戏数据包导出。若直接要求大语言模型输出具体方块坐标，系统容易出现非法材料、坐标不一致、房间不连通和命令不可执行等问题。本文介绍一套面向 Minecraft Java 的建筑生成多智能体系统。系统将大语言模型限制在高层语义决策层，使其输出风格、体块、材料、房间拓扑和设计意图等 JSON；随后由本地确定性几何引擎完成 CSG 体块生成、BSP 房间划分、A* 连通路径、室内装饰、质量校验、自动修复和数据包导出。项目从最初的单一建筑智能体逐步迭代为多智能体流水线，并进一步加入模板语料学习、设计法则蒸馏、审美审计与候选择优机制。当前版本支持无 API key 的 mock 模式，可生成 blueprint.json、architect_datapack、preview.html 和 run_report.md；全量测试结果为 176 项通过、0 项失败。</w:t>
+        <w:t>Minecraft 建筑生成任务同时涉及自然语言理解、空间规划、材料选择、几何约束、连通性校验和游戏数据包导出。若直接要求大语言模型输出具体方块坐标，系统容易出现非法材料、坐标不一致、房间不连通和命令不可执行等问题。本文介绍一套面向 Minecraft Java 的建筑生成多智能体系统。系统将大语言模型限制在高层语义决策层，使其输出风格、体块、材料、房间拓扑和设计意图等 JSON；随后由本地确定性几何引擎完成 CSG 体块生成、BSP 房间划分、A* 连通路径、室内装饰、质量校验、自动修复和数据包导出。项目从最初的单一建筑智能体逐步迭代为多智能体流水线，并逐步加入语义规划、本地几何、质量检查、可视化预览和候选择优机制。当前版本支持无 API key 的 mock 模式，可生成 blueprint.json、architect_datapack、preview.html 和 run_report.md；全量测试结果为 176 项通过、0 项失败。</w:t>
       </w:r>
     </w:p>
     <w:p>
@@ -420,71 +420,6 @@
                 <w:b w:val="0"/>
                 <w:sz w:val="19"/>
               </w:rPr>
-              <w:t>知识层</w:t>
-            </w:r>
-          </w:p>
-        </w:tc>
-        <w:tc>
-          <w:tcPr>
-            <w:tcW w:type="dxa" w:w="3024"/>
-            <w:vAlign w:val="center"/>
-          </w:tcPr>
-          <w:p>
-            <w:pPr>
-              <w:spacing w:after="0"/>
-              <w:ind w:firstLine="0"/>
-              <w:jc w:val="center"/>
-            </w:pPr>
-            <w:r>
-              <w:rPr>
-                <w:rFonts w:ascii="Times New Roman" w:hAnsi="Times New Roman" w:eastAsia="SimSun"/>
-                <w:b w:val="0"/>
-                <w:sz w:val="19"/>
-              </w:rPr>
-              <w:t>TemplateKnowledgeAgent</w:t>
-            </w:r>
-          </w:p>
-        </w:tc>
-        <w:tc>
-          <w:tcPr>
-            <w:tcW w:type="dxa" w:w="4680"/>
-            <w:vAlign w:val="center"/>
-          </w:tcPr>
-          <w:p>
-            <w:pPr>
-              <w:spacing w:after="0"/>
-              <w:ind w:firstLine="0"/>
-              <w:jc w:val="left"/>
-            </w:pPr>
-            <w:r>
-              <w:rPr>
-                <w:rFonts w:ascii="Times New Roman" w:hAnsi="Times New Roman" w:eastAsia="SimSun"/>
-                <w:b w:val="0"/>
-                <w:sz w:val="19"/>
-              </w:rPr>
-              <w:t>从本地 schematic 案例中检索可迁移设计语法</w:t>
-            </w:r>
-          </w:p>
-        </w:tc>
-      </w:tr>
-      <w:tr>
-        <w:tc>
-          <w:tcPr>
-            <w:tcW w:type="dxa" w:w="1656"/>
-            <w:vAlign w:val="center"/>
-          </w:tcPr>
-          <w:p>
-            <w:pPr>
-              <w:spacing w:after="0"/>
-              <w:ind w:firstLine="0"/>
-              <w:jc w:val="center"/>
-            </w:pPr>
-            <w:r>
-              <w:rPr>
-                <w:rFonts w:ascii="Times New Roman" w:hAnsi="Times New Roman" w:eastAsia="SimSun"/>
-                <w:b w:val="0"/>
-                <w:sz w:val="19"/>
-              </w:rPr>
               <w:t>几何层</w:t>
             </w:r>
           </w:p>
@@ -592,7 +527,7 @@
                 <w:b w:val="0"/>
                 <w:sz w:val="19"/>
               </w:rPr>
-              <w:t>校验材料、连通性、模板法则覆盖和命令数量</w:t>
+              <w:t>校验材料、连通性、入口、装饰和命令数量</w:t>
             </w:r>
           </w:p>
         </w:tc>
@@ -814,7 +749,7 @@
         <w:pStyle w:val="Heading2"/>
       </w:pPr>
       <w:r>
-        <w:t>3.3 模板语料学习</w:t>
+        <w:t>3.3 质量检查与可复现导出</w:t>
       </w:r>
     </w:p>
     <w:p>
@@ -827,7 +762,7 @@
           <w:rFonts w:ascii="Times New Roman" w:hAnsi="Times New Roman" w:eastAsia="SimSun"/>
           <w:sz w:val="22"/>
         </w:rPr>
-        <w:t>项目后期加入 mc_templates 下的 64 个本地 schematic 模板。我们没有把模板用作方块级复制库，而是将其分析为可迁移的设计语法，包括场地入口、前景花园、体块轮廓、屋顶语言、立面深度和室内场景。</w:t>
+        <w:t>在生成末端，系统不会直接信任任何单个智能体输出，而是把结构、材料、入口、房间可达性、装饰和命令数量放入统一检查。若发现缺入口、断路、非法方块或命令过多，Repair 与 Optimizer 会在导出前进行修复和压缩。</w:t>
       </w:r>
     </w:p>
     <w:p>
@@ -840,7 +775,7 @@
           <w:rFonts w:ascii="Times New Roman" w:hAnsi="Times New Roman" w:eastAsia="SimSun"/>
           <w:sz w:val="22"/>
         </w:rPr>
-        <w:t>如图 3 所示，模板知识会进入检索、生成、审计和修复闭环。系统记录 source_fusion_policy，要求多来源融合并控制单一来源占比，降低直接复制风险。</w:t>
+        <w:t>如图 3 所示，质量闭环的目标是让一次中文 prompt 最终落到可复现的工程产物：同一个 seed 可以复现同一份 blueprint、预览页、运行报告和 Minecraft 数据包。</w:t>
       </w:r>
     </w:p>
     <w:p>
@@ -861,7 +796,7 @@
               <a:graphicData uri="http://schemas.openxmlformats.org/drawingml/2006/picture">
                 <pic:pic>
                   <pic:nvPicPr>
-                    <pic:cNvPr id="0" name="template_quality_loop.png"/>
+                    <pic:cNvPr id="0" name="quality_loop.png"/>
                     <pic:cNvPicPr/>
                   </pic:nvPicPr>
                   <pic:blipFill>
@@ -896,7 +831,7 @@
           <w:b/>
           <w:sz w:val="21"/>
         </w:rPr>
-        <w:t>图 3 模板语料学习与质量闭环</w:t>
+        <w:t>图 3 质量检查与可复现导出闭环</w:t>
       </w:r>
     </w:p>
     <w:p>
@@ -917,7 +852,7 @@
           <w:rFonts w:ascii="Times New Roman" w:hAnsi="Times New Roman" w:eastAsia="SimSun"/>
           <w:sz w:val="22"/>
         </w:rPr>
-        <w:t>项目的主要工作并不是一次性写出最终架构，而是在多轮实现中逐步修改问题定义。图 4 概括了 Git 历史中几个关键阶段：从初始 agent，到多智能体拆分、语义规划、本地几何、模板语料和质量闭环。</w:t>
+        <w:t>项目的主要工作并不是一次性写出最终架构，而是在多轮实现中逐步修改问题定义。图 4 概括了 Git 历史中几个关键阶段：从初始 agent，到多智能体拆分、语义规划、本地几何、质量检查和提交版本整理。</w:t>
       </w:r>
     </w:p>
     <w:p>
@@ -1007,7 +942,7 @@
           <w:rFonts w:ascii="Times New Roman" w:hAnsi="Times New Roman" w:eastAsia="SimSun"/>
           <w:sz w:val="22"/>
         </w:rPr>
-        <w:t>当前全量测试为 176 项通过、0 项失败，其中包括课程提交文档测试；原项目功能基线为 173 项通过、0 项失败。测试覆盖 Architect fallback、Planner、CSG、BSP、A*、Decorator、模板法则、候选择优、LLM provider、材料目录和可视化输出等模块。</w:t>
+        <w:t>当前全量测试为 176 项通过、0 项失败，其中包括课程提交文档测试；原项目功能基线为 173 项通过、0 项失败。测试覆盖 Architect fallback、Planner、CSG、BSP、A*、Decorator、候选择优、LLM provider、材料目录和可视化输出等模块。</w:t>
       </w:r>
     </w:p>
     <w:p>
@@ -1020,7 +955,7 @@
           <w:rFonts w:ascii="Times New Roman" w:hAnsi="Times New Roman" w:eastAsia="SimSun"/>
           <w:sz w:val="22"/>
         </w:rPr>
-        <w:t>本地样例 out/2026-06-19-145532212 使用 prompt“建造一个木屋别墅”。run_report.md 记录了 LLM 调用状态、seed、几何统计、装饰数量、模板法则覆盖、QA 状态和 Minecraft 使用步骤。该样例说明系统并非只生成文本，而是在输出前经过结构、材料、连通和命令层面的检查。</w:t>
+        <w:t>本地样例 out/2026-06-19-145532212 使用 prompt“建造一个木屋别墅”。run_report.md 记录了 LLM 调用状态、seed、几何统计、装饰数量、QA 状态和 Minecraft 使用步骤。该样例说明系统并非只生成文本，而是在输出前经过结构、材料、连通和命令层面的检查。</w:t>
       </w:r>
     </w:p>
     <w:p>
@@ -1476,7 +1411,7 @@
                 <w:b w:val="0"/>
                 <w:sz w:val="19"/>
               </w:rPr>
-              <w:t>模板法则覆盖</w:t>
+              <w:t>建造入口</w:t>
             </w:r>
           </w:p>
         </w:tc>
@@ -1497,7 +1432,7 @@
                 <w:b w:val="0"/>
                 <w:sz w:val="19"/>
               </w:rPr>
-              <w:t>100%</w:t>
+              <w:t>/function architect:run</w:t>
             </w:r>
           </w:p>
         </w:tc>
@@ -1518,7 +1453,7 @@
                 <w:b w:val="0"/>
                 <w:sz w:val="19"/>
               </w:rPr>
-              <w:t>TemplateLawAutoRepairAgent 补强后达到 law-perfect</w:t>
+              <w:t>数据包内置清理与建造函数</w:t>
             </w:r>
           </w:p>
         </w:tc>
@@ -1543,7 +1478,7 @@
           <w:rFonts w:ascii="Times New Roman" w:hAnsi="Times New Roman" w:eastAsia="SimSun"/>
           <w:sz w:val="22"/>
         </w:rPr>
-        <w:t>从课程要求看，项目的整体性体现在所有模块都围绕同一条主线协作：中文需求输入、智能体语义决策、本地几何落地、质量检查和数据包导出。项目的创新性主要体现在三点。第一，系统清晰区分 LLM 与程序算法的职责，避免让大模型直接处理坐标和命令。第二，模板语料被抽象为设计语法和审美法则，而不是简单复制。第三，项目保留 mock 兜底和自动化测试，使没有 token 或现场网络时仍能复现完整流程。</w:t>
+        <w:t>从课程要求看，项目的整体性体现在所有模块都围绕同一条主线协作：中文需求输入、智能体语义决策、本地几何落地、质量检查和数据包导出。项目的创新性主要体现在三点。第一，系统清晰区分 LLM 与程序算法的职责，避免让大模型直接处理坐标和命令。第二，语义 JSON 与本地几何之间有清晰接口，便于单独测试和回退。第三，项目保留 mock 兜底和自动化测试，使没有 token 或现场网络时仍能复现完整流程。</w:t>
       </w:r>
     </w:p>
     <w:p>
@@ -1556,7 +1491,7 @@
           <w:rFonts w:ascii="Times New Roman" w:hAnsi="Times New Roman" w:eastAsia="SimSun"/>
           <w:sz w:val="22"/>
         </w:rPr>
-        <w:t>项目也存在局限。当前版本不是 Mineflayer 实时机器人，也不模拟玩家逐块放置；GDMC HTTP 客户端虽然保留，但主交付仍是数据包导出。自动审美评分可以发现法则覆盖问题，却不能完全替代玩家视角下的尺度、镜头、路径和 block readability 检查。后续可补充真实游戏截图、人工评分样本，以及更严格的视觉相似性和非复制检测。</w:t>
+        <w:t>项目也存在局限。当前版本不是 Mineflayer 实时机器人，也不模拟玩家逐块放置；GDMC HTTP 客户端虽然保留，但主交付仍是数据包导出。自动检查可以发现结构、材料和连通问题，却不能完全替代玩家视角下的尺度、镜头、路径和 block readability 检查。后续可补充真实游戏截图、人工评分样本，以及更严格的视觉检查。</w:t>
       </w:r>
     </w:p>
     <w:p>
@@ -1590,7 +1525,7 @@
           <w:rFonts w:ascii="Times New Roman" w:hAnsi="Times New Roman" w:eastAsia="SimSun"/>
           <w:sz w:val="22"/>
         </w:rPr>
-        <w:t>通过多智能体分工、CSG/BSP/A* 几何引擎、模板语料学习和质量闭环，项目将一个模糊的建房需求转化为可复现、可检查、可安装的工程产物。相比最终单次生成效果，项目更重要的贡献在于展示了一个课程级智能体系统如何从想法、失败尝试和架构调整中逐步形成。</w:t>
+        <w:t>通过多智能体分工、CSG/BSP/A* 几何引擎和质量闭环，项目将一个模糊的建房需求转化为可复现、可检查、可安装的工程产物。相比最终单次生成效果，项目更重要的贡献在于展示了一个课程级智能体系统如何从想法、失败尝试和架构调整中逐步形成。</w:t>
       </w:r>
     </w:p>
     <w:p>
@@ -1658,7 +1593,7 @@
           <w:rFonts w:ascii="Times New Roman" w:hAnsi="Times New Roman" w:eastAsia="SimSun"/>
           <w:sz w:val="21"/>
         </w:rPr>
-        <w:t>[3] 模板吸收与设计法则相关文档：docs/template-assimilation-plan.md。</w:t>
+        <w:t>[3] 课程提交展示页与提交清单：docs/index.html，SUBMISSION.md。</w:t>
       </w:r>
     </w:p>
     <w:p>
@@ -1671,20 +1606,7 @@
           <w:rFonts w:ascii="Times New Roman" w:hAnsi="Times New Roman" w:eastAsia="SimSun"/>
           <w:sz w:val="21"/>
         </w:rPr>
-        <w:t>[4] 课程提交展示页与提交清单：docs/index.html，SUBMISSION.md。</w:t>
-      </w:r>
-    </w:p>
-    <w:p>
-      <w:pPr>
-        <w:ind w:left="360" w:hanging="360"/>
-        <w:jc w:val="left"/>
-      </w:pPr>
-      <w:r>
-        <w:rPr>
-          <w:rFonts w:ascii="Times New Roman" w:hAnsi="Times New Roman" w:eastAsia="SimSun"/>
-          <w:sz w:val="21"/>
-        </w:rPr>
-        <w:t>[5] 推荐 Prompt 库与截图建议：docs/recommended-prompts.md。</w:t>
+        <w:t>[4] 推荐 Prompt 库与截图建议：docs/recommended-prompts.md。</w:t>
       </w:r>
     </w:p>
     <w:sectPr>

</xml_diff>